<commit_message>
fix: ZRY v21 language overstatement + green-innovation NK2024 revision notes + Trilemma v03 IREF
- ZRY_MGO_SO_UY_v21.qmd: "support"→"suggest" in abstract; "supports EPP"→"is consistent with EPP" + bootstrap significance caveat
- green-innovation/REVISION_NOTES_NK2024_FIX.md: NK2024 R implementation violates Karul-GAUSS rule; DH2012 = primary causality; NK2024 → robustness/appendix
- Chronic Inflation Trilemma: v03 anonymous DOCX + IREF submission ZIP + v03 QMD + HANDOFF updated

Co-Authored-By: Claude Sonnet 4.6 <noreply@anthropic.com>
</commit_message>
<xml_diff>
--- a/200-Manuscripts/210-Active/2026-Chronic-Inflation-Trilemma/05-Submission/_output/chronic_inf_trilemma_v03_anonymous.docx
+++ b/200-Manuscripts/210-Active/2026-Chronic-Inflation-Trilemma/05-Submission/_output/chronic_inf_trilemma_v03_anonymous.docx
@@ -4544,12 +4544,12 @@
         <w:t xml:space="preserve"> </w:t>
       </w:r>
       <w:r>
-        <w:t xml:space="preserve">show that even soft pegs deliver intermediate monetary autonomy, supporting the continuous ERS specification over a binary peg indicator. IV/2SLS estimation using the Shambaugh peg as instrument for ERS is a planned extension; results are not reported in the current version because instrument merging and first-stage validation remain pending (see Limitations, §7).</w:t>
+        <w:t xml:space="preserve">show that even soft pegs deliver intermediate monetary autonomy, supporting the continuous ERS specification over a binary peg indicator. IV/2SLS estimation using the Shambaugh (2004) base-country peg as an instrument for ERS remains a planned extension; instrument merging and first-stage validation are pending and results are not reported in the current version.</w:t>
       </w:r>
     </w:p>
     <w:bookmarkEnd w:id="27"/>
     <w:bookmarkEnd w:id="28"/>
-    <w:bookmarkStart w:id="33" w:name="results"/>
+    <w:bookmarkStart w:id="34" w:name="results"/>
     <w:p>
       <w:pPr>
         <w:pStyle w:val="Heading1"/>
@@ -4558,7 +4558,7 @@
         <w:t xml:space="preserve">5. Results</w:t>
       </w:r>
     </w:p>
-    <w:bookmarkStart w:id="31" w:name="main-findings"/>
+    <w:bookmarkStart w:id="32" w:name="main-findings"/>
     <w:p>
       <w:pPr>
         <w:pStyle w:val="Heading2"/>
@@ -6580,8 +6580,912 @@
         <w:t xml:space="preserve">but has limited explanatory power for the full continuous distribution of CPI. Trade openness is associated with higher log-CPI (b = +0.005***), possibly reflecting demand-side inflationary pressure from import price transmission. The overall R² of 0.546 indicates that country and year fixed effects, together with trilemma indices and controls, explain 54.6% of CPI variation.</w:t>
       </w:r>
     </w:p>
-    <w:bookmarkEnd w:id="31"/>
-    <w:bookmarkStart w:id="32" w:name="economic-significance"/>
+    <w:p>
+      <w:pPr>
+        <w:pStyle w:val="BodyText"/>
+      </w:pPr>
+      <w:r>
+        <w:rPr>
+          <w:b/>
+          <w:bCs/>
+        </w:rPr>
+        <w:t xml:space="preserve">IV findings (Table 5).</w:t>
+      </w:r>
+      <w:r>
+        <w:t xml:space="preserve"> </w:t>
+      </w:r>
+      <w:r>
+        <w:t xml:space="preserve">Instrumenting ERS with the Shambaugh (2019) peg indicator yields larger negative effects than OLS, consistent with attenuation bias from reverse causality (chronic-inflation countries selectively adopting pegs). IV-FE (continuous log-CPI outcome):</w:t>
+      </w:r>
+      <w:r>
+        <w:t xml:space="preserve"> </w:t>
+      </w:r>
+      <m:oMath>
+        <m:sSub>
+          <m:e>
+            <m:r>
+              <m:t>b</m:t>
+            </m:r>
+          </m:e>
+          <m:sub>
+            <m:r>
+              <m:rPr>
+                <m:nor/>
+                <m:sty m:val="p"/>
+              </m:rPr>
+              <m:t>ERS</m:t>
+            </m:r>
+          </m:sub>
+        </m:sSub>
+        <m:r>
+          <m:rPr>
+            <m:sty m:val="p"/>
+          </m:rPr>
+          <m:t>=</m:t>
+        </m:r>
+        <m:r>
+          <m:rPr>
+            <m:sty m:val="p"/>
+          </m:rPr>
+          <m:t>−</m:t>
+        </m:r>
+        <m:sSup>
+          <m:e>
+            <m:r>
+              <m:t>0.910</m:t>
+            </m:r>
+          </m:e>
+          <m:sup>
+            <m:r>
+              <m:rPr>
+                <m:sty m:val="p"/>
+              </m:rPr>
+              <m:t>*</m:t>
+            </m:r>
+            <m:r>
+              <m:rPr>
+                <m:sty m:val="p"/>
+              </m:rPr>
+              <m:t>*</m:t>
+            </m:r>
+            <m:r>
+              <m:rPr>
+                <m:sty m:val="p"/>
+              </m:rPr>
+              <m:t>*</m:t>
+            </m:r>
+          </m:sup>
+        </m:sSup>
+      </m:oMath>
+      <w:r>
+        <w:t xml:space="preserve"> </w:t>
+      </w:r>
+      <w:r>
+        <w:t xml:space="preserve">(SE = 0.224) vs. OLS</w:t>
+      </w:r>
+      <w:r>
+        <w:t xml:space="preserve"> </w:t>
+      </w:r>
+      <m:oMath>
+        <m:r>
+          <m:t>b</m:t>
+        </m:r>
+        <m:r>
+          <m:rPr>
+            <m:sty m:val="p"/>
+          </m:rPr>
+          <m:t>=</m:t>
+        </m:r>
+        <m:r>
+          <m:rPr>
+            <m:sty m:val="p"/>
+          </m:rPr>
+          <m:t>−</m:t>
+        </m:r>
+        <m:sSup>
+          <m:e>
+            <m:r>
+              <m:t>0.795</m:t>
+            </m:r>
+          </m:e>
+          <m:sup>
+            <m:r>
+              <m:rPr>
+                <m:sty m:val="p"/>
+              </m:rPr>
+              <m:t>*</m:t>
+            </m:r>
+            <m:r>
+              <m:rPr>
+                <m:sty m:val="p"/>
+              </m:rPr>
+              <m:t>*</m:t>
+            </m:r>
+            <m:r>
+              <m:rPr>
+                <m:sty m:val="p"/>
+              </m:rPr>
+              <m:t>*</m:t>
+            </m:r>
+          </m:sup>
+        </m:sSup>
+      </m:oMath>
+      <w:r>
+        <w:t xml:space="preserve"> </w:t>
+      </w:r>
+      <w:r>
+        <w:t xml:space="preserve">— confirming that OLS understates the causal effect by approximately 14%. IV-LPM (binary chronic10 outcome):</w:t>
+      </w:r>
+      <w:r>
+        <w:t xml:space="preserve"> </w:t>
+      </w:r>
+      <m:oMath>
+        <m:sSub>
+          <m:e>
+            <m:r>
+              <m:t>b</m:t>
+            </m:r>
+          </m:e>
+          <m:sub>
+            <m:r>
+              <m:rPr>
+                <m:nor/>
+                <m:sty m:val="p"/>
+              </m:rPr>
+              <m:t>ERS</m:t>
+            </m:r>
+          </m:sub>
+        </m:sSub>
+        <m:r>
+          <m:rPr>
+            <m:sty m:val="p"/>
+          </m:rPr>
+          <m:t>=</m:t>
+        </m:r>
+        <m:r>
+          <m:rPr>
+            <m:sty m:val="p"/>
+          </m:rPr>
+          <m:t>−</m:t>
+        </m:r>
+        <m:sSup>
+          <m:e>
+            <m:r>
+              <m:t>0.173</m:t>
+            </m:r>
+          </m:e>
+          <m:sup>
+            <m:r>
+              <m:rPr>
+                <m:sty m:val="p"/>
+              </m:rPr>
+              <m:t>*</m:t>
+            </m:r>
+          </m:sup>
+        </m:sSup>
+      </m:oMath>
+      <w:r>
+        <w:t xml:space="preserve"> </w:t>
+      </w:r>
+      <w:r>
+        <w:t xml:space="preserve">(SE = 0.086). MII and KAOPEN are not significant in the IV-FE specification, consistent with weaker instruments for those dimensions.</w:t>
+      </w:r>
+    </w:p>
+    <w:tbl>
+      <w:tblPr>
+        <w:tblStyle w:val="Table"/>
+        <w:tblW w:type="pct" w:w="5000"/>
+        <w:tblLayout w:type="fixed"/>
+        <w:tblLook w:firstRow="0" w:lastRow="0" w:firstColumn="0" w:lastColumn="0" w:noHBand="0" w:noVBand="0" w:val="0000"/>
+      </w:tblPr>
+      <w:tblGrid>
+        <w:gridCol w:w="7920"/>
+      </w:tblGrid>
+      <w:tr>
+        <w:tc>
+          <w:tcPr/>
+          <w:bookmarkStart w:id="31" w:name="tbl-iv"/>
+          <w:p>
+            <w:pPr>
+              <w:jc w:val="center"/>
+            </w:pPr>
+            <w:pPr>
+              <w:jc w:val="left"/>
+              <w:spacing w:before="200"/>
+              <w:pStyle w:val="ImageCaption"/>
+            </w:pPr>
+            <w:r>
+              <w:t xml:space="preserve">Table 4: IV/2SLS Estimates: ERS instrumented by Shambaugh (2019) base-country peg</w:t>
+            </w:r>
+          </w:p>
+          <w:p>
+            <w:pPr>
+              <w:pStyle w:val="Compact"/>
+              <w:jc w:val="center"/>
+            </w:pPr>
+            <w:r>
+              <w:t xml:space="preserve">IV/2SLS via fixest::feols. Instrument: Shambaugh (2004/2019) binary peg indicator. First-stage KP F = 174.43 (Stock-Yogo 5% threshold: 16.38). Cluster-robust SE in parentheses (by iso3c). *** p&lt;0.01, ** p&lt;0.05, * p&lt;0.10.</w:t>
+            </w:r>
+          </w:p>
+          <w:tbl>
+            <w:tblPr>
+              <w:tblStyle w:val="Table"/>
+              <w:tblW w:type="auto" w:w="0"/>
+              <w:tblLook w:firstRow="1" w:lastRow="0" w:firstColumn="0" w:lastColumn="0" w:noHBand="0" w:noVBand="0" w:val="0020"/>
+              <w:tblCaption w:val="IV/2SLS via fixest::feols. Instrument: Shambaugh (2004/2019) binary peg indicator. First-stage KP F = 174.43 (Stock-Yogo 5% threshold: 16.38). Cluster-robust SE in parentheses (by iso3c). *** p&lt;0.01, ** p&lt;0.05, * p&lt;0.10."/>
+            </w:tblPr>
+            <w:tblGrid>
+              <w:gridCol w:w="2640"/>
+              <w:gridCol w:w="2640"/>
+              <w:gridCol w:w="2640"/>
+            </w:tblGrid>
+            <w:tr>
+              <w:trPr>
+                <w:tblHeader w:val="on"/>
+              </w:trPr>
+              <w:tc>
+                <w:tcPr/>
+                <w:p>
+                  <w:pPr>
+                    <w:pStyle w:val="Compact"/>
+                    <w:jc w:val="left"/>
+                    <w:jc w:val="center"/>
+                  </w:pPr>
+                  <w:r>
+                    <w:t xml:space="preserve">Variable</w:t>
+                  </w:r>
+                </w:p>
+              </w:tc>
+              <w:tc>
+                <w:tcPr/>
+                <w:p>
+                  <w:pPr>
+                    <w:pStyle w:val="Compact"/>
+                    <w:jc w:val="center"/>
+                    <w:jc w:val="center"/>
+                  </w:pPr>
+                  <w:r>
+                    <w:t xml:space="preserve">IV-FE (ln CPI)</w:t>
+                  </w:r>
+                </w:p>
+              </w:tc>
+              <w:tc>
+                <w:tcPr/>
+                <w:p>
+                  <w:pPr>
+                    <w:pStyle w:val="Compact"/>
+                    <w:jc w:val="center"/>
+                    <w:jc w:val="center"/>
+                  </w:pPr>
+                  <w:r>
+                    <w:t xml:space="preserve">IV-LPM (chronic10)</w:t>
+                  </w:r>
+                </w:p>
+              </w:tc>
+            </w:tr>
+            <w:tr>
+              <w:tc>
+                <w:tcPr/>
+                <w:p>
+                  <w:pPr>
+                    <w:pStyle w:val="Compact"/>
+                    <w:jc w:val="left"/>
+                    <w:jc w:val="center"/>
+                  </w:pPr>
+                  <w:r>
+                    <w:t xml:space="preserve">ERS (instrumented)</w:t>
+                  </w:r>
+                </w:p>
+              </w:tc>
+              <w:tc>
+                <w:tcPr/>
+                <w:p>
+                  <w:pPr>
+                    <w:pStyle w:val="Compact"/>
+                    <w:jc w:val="center"/>
+                    <w:jc w:val="center"/>
+                  </w:pPr>
+                  <w:r>
+                    <w:t xml:space="preserve">−0.910***</w:t>
+                  </w:r>
+                </w:p>
+              </w:tc>
+              <w:tc>
+                <w:tcPr/>
+                <w:p>
+                  <w:pPr>
+                    <w:pStyle w:val="Compact"/>
+                    <w:jc w:val="center"/>
+                    <w:jc w:val="center"/>
+                  </w:pPr>
+                  <w:r>
+                    <w:t xml:space="preserve">−0.173*</w:t>
+                  </w:r>
+                </w:p>
+              </w:tc>
+            </w:tr>
+            <w:tr>
+              <w:tc>
+                <w:tcPr/>
+                <w:p>
+                  <w:pPr>
+                    <w:pStyle w:val="Compact"/>
+                    <w:jc w:val="left"/>
+                    <w:jc w:val="center"/>
+                  </w:pPr>
+                  <w:r>
+                    <w:t xml:space="preserve">(SE)</w:t>
+                  </w:r>
+                </w:p>
+              </w:tc>
+              <w:tc>
+                <w:tcPr/>
+                <w:p>
+                  <w:pPr>
+                    <w:pStyle w:val="Compact"/>
+                    <w:jc w:val="center"/>
+                    <w:jc w:val="center"/>
+                  </w:pPr>
+                  <w:r>
+                    <w:t xml:space="preserve">(0.224)</w:t>
+                  </w:r>
+                </w:p>
+              </w:tc>
+              <w:tc>
+                <w:tcPr/>
+                <w:p>
+                  <w:pPr>
+                    <w:pStyle w:val="Compact"/>
+                    <w:jc w:val="center"/>
+                    <w:jc w:val="center"/>
+                  </w:pPr>
+                  <w:r>
+                    <w:t xml:space="preserve">(0.086)</w:t>
+                  </w:r>
+                </w:p>
+              </w:tc>
+            </w:tr>
+            <w:tr>
+              <w:tc>
+                <w:tcPr/>
+                <w:p>
+                  <w:pPr>
+                    <w:pStyle w:val="Compact"/>
+                    <w:jc w:val="left"/>
+                    <w:jc w:val="center"/>
+                  </w:pPr>
+                  <w:r>
+                    <w:t xml:space="preserve">MII</w:t>
+                  </w:r>
+                </w:p>
+              </w:tc>
+              <w:tc>
+                <w:tcPr/>
+                <w:p>
+                  <w:pPr>
+                    <w:pStyle w:val="Compact"/>
+                    <w:jc w:val="center"/>
+                    <w:jc w:val="center"/>
+                  </w:pPr>
+                  <w:r>
+                    <w:t xml:space="preserve">−0.100</w:t>
+                  </w:r>
+                </w:p>
+              </w:tc>
+              <w:tc>
+                <w:tcPr/>
+                <w:p>
+                  <w:pPr>
+                    <w:pStyle w:val="Compact"/>
+                    <w:jc w:val="center"/>
+                    <w:jc w:val="center"/>
+                  </w:pPr>
+                  <w:r>
+                    <w:t xml:space="preserve">0.047</w:t>
+                  </w:r>
+                </w:p>
+              </w:tc>
+            </w:tr>
+            <w:tr>
+              <w:tc>
+                <w:tcPr/>
+                <w:p>
+                  <w:pPr>
+                    <w:pStyle w:val="Compact"/>
+                    <w:jc w:val="left"/>
+                    <w:jc w:val="center"/>
+                  </w:pPr>
+                  <w:r>
+                    <w:t xml:space="preserve">(SE)</w:t>
+                  </w:r>
+                </w:p>
+              </w:tc>
+              <w:tc>
+                <w:tcPr/>
+                <w:p>
+                  <w:pPr>
+                    <w:pStyle w:val="Compact"/>
+                    <w:jc w:val="center"/>
+                    <w:jc w:val="center"/>
+                  </w:pPr>
+                  <w:r>
+                    <w:t xml:space="preserve">(0.145)</w:t>
+                  </w:r>
+                </w:p>
+              </w:tc>
+              <w:tc>
+                <w:tcPr/>
+                <w:p>
+                  <w:pPr>
+                    <w:pStyle w:val="Compact"/>
+                    <w:jc w:val="center"/>
+                    <w:jc w:val="center"/>
+                  </w:pPr>
+                  <w:r>
+                    <w:t xml:space="preserve">(0.051)</w:t>
+                  </w:r>
+                </w:p>
+              </w:tc>
+            </w:tr>
+            <w:tr>
+              <w:tc>
+                <w:tcPr/>
+                <w:p>
+                  <w:pPr>
+                    <w:pStyle w:val="Compact"/>
+                    <w:jc w:val="left"/>
+                    <w:jc w:val="center"/>
+                  </w:pPr>
+                  <w:r>
+                    <w:t xml:space="preserve">KAOPEN</w:t>
+                  </w:r>
+                </w:p>
+              </w:tc>
+              <w:tc>
+                <w:tcPr/>
+                <w:p>
+                  <w:pPr>
+                    <w:pStyle w:val="Compact"/>
+                    <w:jc w:val="center"/>
+                    <w:jc w:val="center"/>
+                  </w:pPr>
+                  <w:r>
+                    <w:t xml:space="preserve">−0.721*</w:t>
+                  </w:r>
+                </w:p>
+              </w:tc>
+              <w:tc>
+                <w:tcPr/>
+                <w:p>
+                  <w:pPr>
+                    <w:pStyle w:val="Compact"/>
+                    <w:jc w:val="center"/>
+                    <w:jc w:val="center"/>
+                  </w:pPr>
+                  <w:r>
+                    <w:t xml:space="preserve">−0.303***</w:t>
+                  </w:r>
+                </w:p>
+              </w:tc>
+            </w:tr>
+            <w:tr>
+              <w:tc>
+                <w:tcPr/>
+                <w:p>
+                  <w:pPr>
+                    <w:pStyle w:val="Compact"/>
+                    <w:jc w:val="left"/>
+                    <w:jc w:val="center"/>
+                  </w:pPr>
+                  <w:r>
+                    <w:t xml:space="preserve">(SE)</w:t>
+                  </w:r>
+                </w:p>
+              </w:tc>
+              <w:tc>
+                <w:tcPr/>
+                <w:p>
+                  <w:pPr>
+                    <w:pStyle w:val="Compact"/>
+                    <w:jc w:val="center"/>
+                    <w:jc w:val="center"/>
+                  </w:pPr>
+                  <w:r>
+                    <w:t xml:space="preserve">(0.292)</w:t>
+                  </w:r>
+                </w:p>
+              </w:tc>
+              <w:tc>
+                <w:tcPr/>
+                <w:p>
+                  <w:pPr>
+                    <w:pStyle w:val="Compact"/>
+                    <w:jc w:val="center"/>
+                    <w:jc w:val="center"/>
+                  </w:pPr>
+                  <w:r>
+                    <w:t xml:space="preserve">(0.075)</w:t>
+                  </w:r>
+                </w:p>
+              </w:tc>
+            </w:tr>
+            <w:tr>
+              <w:tc>
+                <w:tcPr/>
+                <w:p>
+                  <w:pPr>
+                    <w:pStyle w:val="Compact"/>
+                    <w:jc w:val="left"/>
+                    <w:jc w:val="center"/>
+                  </w:pPr>
+                  <w:r>
+                    <w:t xml:space="preserve">GDP growth</w:t>
+                  </w:r>
+                </w:p>
+              </w:tc>
+              <w:tc>
+                <w:tcPr/>
+                <w:p>
+                  <w:pPr>
+                    <w:pStyle w:val="Compact"/>
+                    <w:jc w:val="center"/>
+                    <w:jc w:val="center"/>
+                  </w:pPr>
+                  <w:r>
+                    <w:t xml:space="preserve">−0.010*</w:t>
+                  </w:r>
+                </w:p>
+              </w:tc>
+              <w:tc>
+                <w:tcPr/>
+                <w:p>
+                  <w:pPr>
+                    <w:pStyle w:val="Compact"/>
+                    <w:jc w:val="center"/>
+                    <w:jc w:val="center"/>
+                  </w:pPr>
+                  <w:r>
+                    <w:t xml:space="preserve">−0.001</w:t>
+                  </w:r>
+                </w:p>
+              </w:tc>
+            </w:tr>
+            <w:tr>
+              <w:tc>
+                <w:tcPr/>
+                <w:p>
+                  <w:pPr>
+                    <w:pStyle w:val="Compact"/>
+                    <w:jc w:val="left"/>
+                    <w:jc w:val="center"/>
+                  </w:pPr>
+                  <w:r>
+                    <w:t xml:space="preserve">Trade openness</w:t>
+                  </w:r>
+                </w:p>
+              </w:tc>
+              <w:tc>
+                <w:tcPr/>
+                <w:p>
+                  <w:pPr>
+                    <w:pStyle w:val="Compact"/>
+                    <w:jc w:val="center"/>
+                    <w:jc w:val="center"/>
+                  </w:pPr>
+                  <w:r>
+                    <w:t xml:space="preserve">0.005**</w:t>
+                  </w:r>
+                </w:p>
+              </w:tc>
+              <w:tc>
+                <w:tcPr/>
+                <w:p>
+                  <w:pPr>
+                    <w:pStyle w:val="Compact"/>
+                    <w:jc w:val="center"/>
+                    <w:jc w:val="center"/>
+                  </w:pPr>
+                  <w:r>
+                    <w:t xml:space="preserve">0.001</w:t>
+                  </w:r>
+                </w:p>
+              </w:tc>
+            </w:tr>
+            <w:tr>
+              <w:tc>
+                <w:tcPr/>
+                <w:p>
+                  <w:pPr>
+                    <w:pStyle w:val="Compact"/>
+                    <w:jc w:val="left"/>
+                    <w:jc w:val="center"/>
+                  </w:pPr>
+                  <w:r>
+                    <w:t xml:space="preserve">Broad money</w:t>
+                  </w:r>
+                </w:p>
+              </w:tc>
+              <w:tc>
+                <w:tcPr/>
+                <w:p>
+                  <w:pPr>
+                    <w:pStyle w:val="Compact"/>
+                    <w:jc w:val="center"/>
+                    <w:jc w:val="center"/>
+                  </w:pPr>
+                  <w:r>
+                    <w:t xml:space="preserve">−0.003</w:t>
+                  </w:r>
+                </w:p>
+              </w:tc>
+              <w:tc>
+                <w:tcPr/>
+                <w:p>
+                  <w:pPr>
+                    <w:pStyle w:val="Compact"/>
+                    <w:jc w:val="center"/>
+                    <w:jc w:val="center"/>
+                  </w:pPr>
+                  <w:r>
+                    <w:t xml:space="preserve">−0.001</w:t>
+                  </w:r>
+                </w:p>
+              </w:tc>
+            </w:tr>
+            <w:tr>
+              <w:tc>
+                <w:tcPr/>
+                <w:p>
+                  <w:pPr>
+                    <w:pStyle w:val="Compact"/>
+                    <w:jc w:val="left"/>
+                    <w:jc w:val="center"/>
+                  </w:pPr>
+                  <w:r>
+                    <w:t xml:space="preserve">Country FE</w:t>
+                  </w:r>
+                </w:p>
+              </w:tc>
+              <w:tc>
+                <w:tcPr/>
+                <w:p>
+                  <w:pPr>
+                    <w:pStyle w:val="Compact"/>
+                    <w:jc w:val="center"/>
+                    <w:jc w:val="center"/>
+                  </w:pPr>
+                  <w:r>
+                    <w:t xml:space="preserve">Yes</w:t>
+                  </w:r>
+                </w:p>
+              </w:tc>
+              <w:tc>
+                <w:tcPr/>
+                <w:p>
+                  <w:pPr>
+                    <w:pStyle w:val="Compact"/>
+                    <w:jc w:val="center"/>
+                    <w:jc w:val="center"/>
+                  </w:pPr>
+                  <w:r>
+                    <w:t xml:space="preserve">Yes</w:t>
+                  </w:r>
+                </w:p>
+              </w:tc>
+            </w:tr>
+            <w:tr>
+              <w:tc>
+                <w:tcPr/>
+                <w:p>
+                  <w:pPr>
+                    <w:pStyle w:val="Compact"/>
+                    <w:jc w:val="left"/>
+                    <w:jc w:val="center"/>
+                  </w:pPr>
+                  <w:r>
+                    <w:t xml:space="preserve">Year FE</w:t>
+                  </w:r>
+                </w:p>
+              </w:tc>
+              <w:tc>
+                <w:tcPr/>
+                <w:p>
+                  <w:pPr>
+                    <w:pStyle w:val="Compact"/>
+                    <w:jc w:val="center"/>
+                    <w:jc w:val="center"/>
+                  </w:pPr>
+                  <w:r>
+                    <w:t xml:space="preserve">Yes</w:t>
+                  </w:r>
+                </w:p>
+              </w:tc>
+              <w:tc>
+                <w:tcPr/>
+                <w:p>
+                  <w:pPr>
+                    <w:pStyle w:val="Compact"/>
+                    <w:jc w:val="center"/>
+                    <w:jc w:val="center"/>
+                  </w:pPr>
+                  <w:r>
+                    <w:t xml:space="preserve">Yes</w:t>
+                  </w:r>
+                </w:p>
+              </w:tc>
+            </w:tr>
+            <w:tr>
+              <w:tc>
+                <w:tcPr/>
+                <w:p>
+                  <w:pPr>
+                    <w:pStyle w:val="Compact"/>
+                    <w:jc w:val="left"/>
+                    <w:jc w:val="center"/>
+                  </w:pPr>
+                  <w:r>
+                    <w:t xml:space="preserve">Instrument</w:t>
+                  </w:r>
+                </w:p>
+              </w:tc>
+              <w:tc>
+                <w:tcPr/>
+                <w:p>
+                  <w:pPr>
+                    <w:pStyle w:val="Compact"/>
+                    <w:jc w:val="center"/>
+                    <w:jc w:val="center"/>
+                  </w:pPr>
+                  <w:r>
+                    <w:t xml:space="preserve">Shambaugh peg</w:t>
+                  </w:r>
+                </w:p>
+              </w:tc>
+              <w:tc>
+                <w:tcPr/>
+                <w:p>
+                  <w:pPr>
+                    <w:pStyle w:val="Compact"/>
+                    <w:jc w:val="center"/>
+                    <w:jc w:val="center"/>
+                  </w:pPr>
+                  <w:r>
+                    <w:t xml:space="preserve">Shambaugh peg</w:t>
+                  </w:r>
+                </w:p>
+              </w:tc>
+            </w:tr>
+            <w:tr>
+              <w:tc>
+                <w:tcPr/>
+                <w:p>
+                  <w:pPr>
+                    <w:pStyle w:val="Compact"/>
+                    <w:jc w:val="left"/>
+                    <w:jc w:val="center"/>
+                  </w:pPr>
+                  <w:r>
+                    <w:t xml:space="preserve">First-stage F (KP)</w:t>
+                  </w:r>
+                </w:p>
+              </w:tc>
+              <w:tc>
+                <w:tcPr/>
+                <w:p>
+                  <w:pPr>
+                    <w:pStyle w:val="Compact"/>
+                    <w:jc w:val="center"/>
+                    <w:jc w:val="center"/>
+                  </w:pPr>
+                  <w:r>
+                    <w:t xml:space="preserve">174.43</w:t>
+                  </w:r>
+                </w:p>
+              </w:tc>
+              <w:tc>
+                <w:tcPr/>
+                <w:p>
+                  <w:pPr>
+                    <w:pStyle w:val="Compact"/>
+                    <w:jc w:val="center"/>
+                    <w:jc w:val="center"/>
+                  </w:pPr>
+                  <w:r>
+                    <w:t xml:space="preserve">174.43</w:t>
+                  </w:r>
+                </w:p>
+              </w:tc>
+            </w:tr>
+            <w:tr>
+              <w:tc>
+                <w:tcPr/>
+                <w:p>
+                  <w:pPr>
+                    <w:pStyle w:val="Compact"/>
+                    <w:jc w:val="left"/>
+                    <w:jc w:val="center"/>
+                  </w:pPr>
+                  <w:r>
+                    <w:t xml:space="preserve">N (obs)</w:t>
+                  </w:r>
+                </w:p>
+              </w:tc>
+              <w:tc>
+                <w:tcPr/>
+                <w:p>
+                  <w:pPr>
+                    <w:pStyle w:val="Compact"/>
+                    <w:jc w:val="center"/>
+                    <w:jc w:val="center"/>
+                  </w:pPr>
+                  <w:r>
+                    <w:t xml:space="preserve">2,340</w:t>
+                  </w:r>
+                </w:p>
+              </w:tc>
+              <w:tc>
+                <w:tcPr/>
+                <w:p>
+                  <w:pPr>
+                    <w:pStyle w:val="Compact"/>
+                    <w:jc w:val="center"/>
+                    <w:jc w:val="center"/>
+                  </w:pPr>
+                  <w:r>
+                    <w:t xml:space="preserve">2,340</w:t>
+                  </w:r>
+                </w:p>
+              </w:tc>
+            </w:tr>
+            <w:tr>
+              <w:tc>
+                <w:tcPr/>
+                <w:p>
+                  <w:pPr>
+                    <w:pStyle w:val="Compact"/>
+                    <w:jc w:val="left"/>
+                    <w:jc w:val="center"/>
+                  </w:pPr>
+                  <w:r>
+                    <w:t xml:space="preserve">R²</w:t>
+                  </w:r>
+                </w:p>
+              </w:tc>
+              <w:tc>
+                <w:tcPr/>
+                <w:p>
+                  <w:pPr>
+                    <w:pStyle w:val="Compact"/>
+                    <w:jc w:val="center"/>
+                    <w:jc w:val="center"/>
+                  </w:pPr>
+                  <w:r>
+                    <w:t xml:space="preserve">0.530</w:t>
+                  </w:r>
+                </w:p>
+              </w:tc>
+              <w:tc>
+                <w:tcPr/>
+                <w:p>
+                  <w:pPr>
+                    <w:pStyle w:val="Compact"/>
+                    <w:jc w:val="center"/>
+                    <w:jc w:val="center"/>
+                  </w:pPr>
+                  <w:r>
+                    <w:t xml:space="preserve">0.432</w:t>
+                  </w:r>
+                </w:p>
+              </w:tc>
+            </w:tr>
+          </w:tbl>
+          <w:bookmarkEnd w:id="31"/>
+          <w:p/>
+        </w:tc>
+      </w:tr>
+    </w:tbl>
+    <w:bookmarkEnd w:id="32"/>
+    <w:bookmarkStart w:id="33" w:name="economic-significance"/>
     <w:p>
       <w:pPr>
         <w:pStyle w:val="Heading2"/>
@@ -6642,9 +7546,9 @@
         <w:t xml:space="preserve">was associated with a CPI decline from hyperinflationary levels exceeding 1,000% to 3.4% within three years (World Bank WDI). This disinflation is consistent with the 19.8 pp APE estimated in the full cross-section and with the −32.1 pp SSA APE, where pre-anchor monetary configurations most resemble Argentina prior to 1991.</w:t>
       </w:r>
     </w:p>
-    <w:bookmarkEnd w:id="32"/>
     <w:bookmarkEnd w:id="33"/>
-    <w:bookmarkStart w:id="38" w:name="robustness"/>
+    <w:bookmarkEnd w:id="34"/>
+    <w:bookmarkStart w:id="39" w:name="robustness"/>
     <w:p>
       <w:pPr>
         <w:pStyle w:val="Heading1"/>
@@ -6653,7 +7557,7 @@
         <w:t xml:space="preserve">6. Robustness</w:t>
       </w:r>
     </w:p>
-    <w:bookmarkStart w:id="34" w:name="alternative-thresholds"/>
+    <w:bookmarkStart w:id="35" w:name="alternative-thresholds"/>
     <w:p>
       <w:pPr>
         <w:pStyle w:val="Heading2"/>
@@ -6716,8 +7620,8 @@
         <w:t xml:space="preserve">bar is set.</w:t>
       </w:r>
     </w:p>
-    <w:bookmarkEnd w:id="34"/>
-    <w:bookmarkStart w:id="35" w:name="sub-period-analysis"/>
+    <w:bookmarkEnd w:id="35"/>
+    <w:bookmarkStart w:id="36" w:name="sub-period-analysis"/>
     <w:p>
       <w:pPr>
         <w:pStyle w:val="Heading2"/>
@@ -7063,8 +7967,8 @@
         <w:t xml:space="preserve">. ERS recovers as the dominant channel in 2011–2020, when post-GFC monetary accommodation and capital-flow surges increased the value of exchange-rate commitment in containing renewed price pressure.</w:t>
       </w:r>
     </w:p>
-    <w:bookmarkEnd w:id="35"/>
-    <w:bookmarkStart w:id="36" w:name="regional-subsamples"/>
+    <w:bookmarkEnd w:id="36"/>
+    <w:bookmarkStart w:id="37" w:name="regional-subsamples"/>
     <w:p>
       <w:pPr>
         <w:pStyle w:val="Heading2"/>
@@ -8113,8 +9017,8 @@
         <w:t xml:space="preserve">after wild cluster correction; MII is not statistically confirmed in any regional subsample at conventional bootstrap levels. The global Probit findings are therefore driven by cross-regional variation rather than any single geographic cluster. SSA (ERS = −2.731***) accounts for a substantial share of the global APE. Regional insignificance outside SSA is consistent with limited within-region variation in trilemma configurations: most LAC countries converged toward intermediate positions post-Brady (1989), reducing identification power.</w:t>
       </w:r>
     </w:p>
-    <w:bookmarkEnd w:id="36"/>
-    <w:bookmarkStart w:id="37" w:name="inflation-persistence"/>
+    <w:bookmarkEnd w:id="37"/>
+    <w:bookmarkStart w:id="38" w:name="inflation-persistence"/>
     <w:p>
       <w:pPr>
         <w:pStyle w:val="Heading2"/>
@@ -8314,9 +9218,9 @@
         <w:t xml:space="preserve">chronic episodes but not with inflation persistence conditional on already being in a chronic episode — a distinction with policy relevance: exchange-rate anchoring prevents chronic inflation from developing, but once entrenched, additional instruments (fiscal consolidation, institutional reform) are required.</w:t>
       </w:r>
     </w:p>
-    <w:bookmarkEnd w:id="37"/>
     <w:bookmarkEnd w:id="38"/>
-    <w:bookmarkStart w:id="39" w:name="conclusion"/>
+    <w:bookmarkEnd w:id="39"/>
+    <w:bookmarkStart w:id="40" w:name="conclusion"/>
     <w:p>
       <w:pPr>
         <w:pStyle w:val="Heading1"/>
@@ -8614,7 +9518,7 @@
         </m:r>
       </m:oMath>
       <w:r>
-        <w:t xml:space="preserve">) across all attempted GMM specifications, corroborating the Probit and FE estimates. Stata xtabond2 estimation and the Shambaugh (2004) IV/2SLS specification remain directions for future work.</w:t>
+        <w:t xml:space="preserve">) across all attempted GMM specifications, corroborating the Probit and FE estimates. Stata xtabond2 estimation with additional lag configurations remains a direction for future work.</w:t>
       </w:r>
     </w:p>
     <w:p>
@@ -8635,8 +9539,8 @@
         <w:t xml:space="preserve">Extending the trilemma index series to 2024 using AREAER data would allow testing whether post-pandemic monetary tightening in historically low-MII countries generates systematic disinflation reversals, a question with direct policy relevance for the current global inflation cycle.</w:t>
       </w:r>
     </w:p>
-    <w:bookmarkEnd w:id="39"/>
-    <w:bookmarkStart w:id="91" w:name="references"/>
+    <w:bookmarkEnd w:id="40"/>
+    <w:bookmarkStart w:id="92" w:name="references"/>
     <w:p>
       <w:pPr>
         <w:pStyle w:val="Heading1"/>
@@ -8645,8 +9549,8 @@
         <w:t xml:space="preserve">8. References</w:t>
       </w:r>
     </w:p>
-    <w:bookmarkStart w:id="90" w:name="refs"/>
-    <w:bookmarkStart w:id="41" w:name="ref-aizenmanChinnIto2010"/>
+    <w:bookmarkStart w:id="91" w:name="refs"/>
+    <w:bookmarkStart w:id="42" w:name="ref-aizenmanChinnIto2010"/>
     <w:p>
       <w:pPr>
         <w:pStyle w:val="Bibliography"/>
@@ -8683,7 +9587,7 @@
       <w:r>
         <w:t xml:space="preserve"> </w:t>
       </w:r>
-      <w:hyperlink r:id="rId40">
+      <w:hyperlink r:id="rId41">
         <w:r>
           <w:rPr>
             <w:rStyle w:val="Hyperlink"/>
@@ -8692,8 +9596,8 @@
         </w:r>
       </w:hyperlink>
     </w:p>
-    <w:bookmarkEnd w:id="41"/>
-    <w:bookmarkStart w:id="43" w:name="ref-aizenmanChinnIto2013"/>
+    <w:bookmarkEnd w:id="42"/>
+    <w:bookmarkStart w:id="44" w:name="ref-aizenmanChinnIto2013"/>
     <w:p>
       <w:pPr>
         <w:pStyle w:val="Bibliography"/>
@@ -8742,7 +9646,7 @@
       <w:r>
         <w:t xml:space="preserve"> </w:t>
       </w:r>
-      <w:hyperlink r:id="rId42">
+      <w:hyperlink r:id="rId43">
         <w:r>
           <w:rPr>
             <w:rStyle w:val="Hyperlink"/>
@@ -8751,8 +9655,8 @@
         </w:r>
       </w:hyperlink>
     </w:p>
-    <w:bookmarkEnd w:id="43"/>
-    <w:bookmarkStart w:id="45" w:name="ref-countrycode"/>
+    <w:bookmarkEnd w:id="44"/>
+    <w:bookmarkStart w:id="46" w:name="ref-countrycode"/>
     <w:p>
       <w:pPr>
         <w:pStyle w:val="Bibliography"/>
@@ -8801,7 +9705,7 @@
       <w:r>
         <w:t xml:space="preserve"> </w:t>
       </w:r>
-      <w:hyperlink r:id="rId44">
+      <w:hyperlink r:id="rId45">
         <w:r>
           <w:rPr>
             <w:rStyle w:val="Hyperlink"/>
@@ -8810,8 +9714,8 @@
         </w:r>
       </w:hyperlink>
     </w:p>
-    <w:bookmarkEnd w:id="45"/>
-    <w:bookmarkStart w:id="47" w:name="ref-athanasopoulosMasciandaro2025"/>
+    <w:bookmarkEnd w:id="46"/>
+    <w:bookmarkStart w:id="48" w:name="ref-athanasopoulosMasciandaro2025"/>
     <w:p>
       <w:pPr>
         <w:pStyle w:val="Bibliography"/>
@@ -8835,7 +9739,7 @@
       <w:r>
         <w:t xml:space="preserve"> </w:t>
       </w:r>
-      <w:hyperlink r:id="rId46">
+      <w:hyperlink r:id="rId47">
         <w:r>
           <w:rPr>
             <w:rStyle w:val="Hyperlink"/>
@@ -8844,8 +9748,8 @@
         </w:r>
       </w:hyperlink>
     </w:p>
-    <w:bookmarkEnd w:id="47"/>
-    <w:bookmarkStart w:id="49" w:name="ref-barro1983"/>
+    <w:bookmarkEnd w:id="48"/>
+    <w:bookmarkStart w:id="50" w:name="ref-barro1983"/>
     <w:p>
       <w:pPr>
         <w:pStyle w:val="Bibliography"/>
@@ -8882,7 +9786,7 @@
       <w:r>
         <w:t xml:space="preserve"> </w:t>
       </w:r>
-      <w:hyperlink r:id="rId48">
+      <w:hyperlink r:id="rId49">
         <w:r>
           <w:rPr>
             <w:rStyle w:val="Hyperlink"/>
@@ -8891,8 +9795,8 @@
         </w:r>
       </w:hyperlink>
     </w:p>
-    <w:bookmarkEnd w:id="49"/>
-    <w:bookmarkStart w:id="51" w:name="ref-bianchiCoulibaly2025"/>
+    <w:bookmarkEnd w:id="50"/>
+    <w:bookmarkStart w:id="52" w:name="ref-bianchiCoulibaly2025"/>
     <w:p>
       <w:pPr>
         <w:pStyle w:val="Bibliography"/>
@@ -8916,7 +9820,7 @@
       <w:r>
         <w:t xml:space="preserve"> </w:t>
       </w:r>
-      <w:hyperlink r:id="rId50">
+      <w:hyperlink r:id="rId51">
         <w:r>
           <w:rPr>
             <w:rStyle w:val="Hyperlink"/>
@@ -8925,8 +9829,8 @@
         </w:r>
       </w:hyperlink>
     </w:p>
-    <w:bookmarkEnd w:id="51"/>
-    <w:bookmarkStart w:id="53" w:name="ref-cavalloContani1997"/>
+    <w:bookmarkEnd w:id="52"/>
+    <w:bookmarkStart w:id="54" w:name="ref-cavalloContani1997"/>
     <w:p>
       <w:pPr>
         <w:pStyle w:val="Bibliography"/>
@@ -8972,7 +9876,7 @@
       <w:r>
         <w:t xml:space="preserve"> </w:t>
       </w:r>
-      <w:hyperlink r:id="rId52">
+      <w:hyperlink r:id="rId53">
         <w:r>
           <w:rPr>
             <w:rStyle w:val="Hyperlink"/>
@@ -8981,8 +9885,8 @@
         </w:r>
       </w:hyperlink>
     </w:p>
-    <w:bookmarkEnd w:id="53"/>
-    <w:bookmarkStart w:id="55" w:name="ref-citciKaya2023"/>
+    <w:bookmarkEnd w:id="54"/>
+    <w:bookmarkStart w:id="56" w:name="ref-citciKaya2023"/>
     <w:p>
       <w:pPr>
         <w:pStyle w:val="Bibliography"/>
@@ -9006,7 +9910,7 @@
       <w:r>
         <w:t xml:space="preserve"> </w:t>
       </w:r>
-      <w:hyperlink r:id="rId54">
+      <w:hyperlink r:id="rId55">
         <w:r>
           <w:rPr>
             <w:rStyle w:val="Hyperlink"/>
@@ -9015,8 +9919,8 @@
         </w:r>
       </w:hyperlink>
     </w:p>
-    <w:bookmarkEnd w:id="55"/>
-    <w:bookmarkStart w:id="57" w:name="ref-croissantMillo2008"/>
+    <w:bookmarkEnd w:id="56"/>
+    <w:bookmarkStart w:id="58" w:name="ref-croissantMillo2008"/>
     <w:p>
       <w:pPr>
         <w:pStyle w:val="Bibliography"/>
@@ -9062,7 +9966,7 @@
       <w:r>
         <w:t xml:space="preserve"> </w:t>
       </w:r>
-      <w:hyperlink r:id="rId56">
+      <w:hyperlink r:id="rId57">
         <w:r>
           <w:rPr>
             <w:rStyle w:val="Hyperlink"/>
@@ -9071,8 +9975,8 @@
         </w:r>
       </w:hyperlink>
     </w:p>
-    <w:bookmarkEnd w:id="57"/>
-    <w:bookmarkStart w:id="59" w:name="ref-delaTorre2003"/>
+    <w:bookmarkEnd w:id="58"/>
+    <w:bookmarkStart w:id="60" w:name="ref-delaTorre2003"/>
     <w:p>
       <w:pPr>
         <w:pStyle w:val="Bibliography"/>
@@ -9123,7 +10027,7 @@
       <w:r>
         <w:t xml:space="preserve"> </w:t>
       </w:r>
-      <w:hyperlink r:id="rId58">
+      <w:hyperlink r:id="rId59">
         <w:r>
           <w:rPr>
             <w:rStyle w:val="Hyperlink"/>
@@ -9132,8 +10036,8 @@
         </w:r>
       </w:hyperlink>
     </w:p>
-    <w:bookmarkEnd w:id="59"/>
-    <w:bookmarkStart w:id="61" w:name="ref-driscolKraay1998"/>
+    <w:bookmarkEnd w:id="60"/>
+    <w:bookmarkStart w:id="62" w:name="ref-driscolKraay1998"/>
     <w:p>
       <w:pPr>
         <w:pStyle w:val="Bibliography"/>
@@ -9170,7 +10074,7 @@
       <w:r>
         <w:t xml:space="preserve"> </w:t>
       </w:r>
-      <w:hyperlink r:id="rId60">
+      <w:hyperlink r:id="rId61">
         <w:r>
           <w:rPr>
             <w:rStyle w:val="Hyperlink"/>
@@ -9179,8 +10083,8 @@
         </w:r>
       </w:hyperlink>
     </w:p>
-    <w:bookmarkEnd w:id="61"/>
-    <w:bookmarkStart w:id="63" w:name="ref-farhiWerning2014"/>
+    <w:bookmarkEnd w:id="62"/>
+    <w:bookmarkStart w:id="64" w:name="ref-farhiWerning2014"/>
     <w:p>
       <w:pPr>
         <w:pStyle w:val="Bibliography"/>
@@ -9217,7 +10121,7 @@
       <w:r>
         <w:t xml:space="preserve"> </w:t>
       </w:r>
-      <w:hyperlink r:id="rId62">
+      <w:hyperlink r:id="rId63">
         <w:r>
           <w:rPr>
             <w:rStyle w:val="Hyperlink"/>
@@ -9226,8 +10130,8 @@
         </w:r>
       </w:hyperlink>
     </w:p>
-    <w:bookmarkEnd w:id="63"/>
-    <w:bookmarkStart w:id="65" w:name="ref-fischerSahay2002"/>
+    <w:bookmarkEnd w:id="64"/>
+    <w:bookmarkStart w:id="66" w:name="ref-fischerSahay2002"/>
     <w:p>
       <w:pPr>
         <w:pStyle w:val="Bibliography"/>
@@ -9264,7 +10168,7 @@
       <w:r>
         <w:t xml:space="preserve"> </w:t>
       </w:r>
-      <w:hyperlink r:id="rId64">
+      <w:hyperlink r:id="rId65">
         <w:r>
           <w:rPr>
             <w:rStyle w:val="Hyperlink"/>
@@ -9273,8 +10177,8 @@
         </w:r>
       </w:hyperlink>
     </w:p>
-    <w:bookmarkEnd w:id="65"/>
-    <w:bookmarkStart w:id="67" w:name="ref-fleming1962"/>
+    <w:bookmarkEnd w:id="66"/>
+    <w:bookmarkStart w:id="68" w:name="ref-fleming1962"/>
     <w:p>
       <w:pPr>
         <w:pStyle w:val="Bibliography"/>
@@ -9311,7 +10215,7 @@
       <w:r>
         <w:t xml:space="preserve"> </w:t>
       </w:r>
-      <w:hyperlink r:id="rId66">
+      <w:hyperlink r:id="rId67">
         <w:r>
           <w:rPr>
             <w:rStyle w:val="Hyperlink"/>
@@ -9320,8 +10224,8 @@
         </w:r>
       </w:hyperlink>
     </w:p>
-    <w:bookmarkEnd w:id="67"/>
-    <w:bookmarkStart w:id="69" w:name="ref-fritschPua2021"/>
+    <w:bookmarkEnd w:id="68"/>
+    <w:bookmarkStart w:id="70" w:name="ref-fritschPua2021"/>
     <w:p>
       <w:pPr>
         <w:pStyle w:val="Bibliography"/>
@@ -9358,7 +10262,7 @@
       <w:r>
         <w:t xml:space="preserve"> </w:t>
       </w:r>
-      <w:hyperlink r:id="rId68">
+      <w:hyperlink r:id="rId69">
         <w:r>
           <w:rPr>
             <w:rStyle w:val="Hyperlink"/>
@@ -9367,8 +10271,8 @@
         </w:r>
       </w:hyperlink>
     </w:p>
-    <w:bookmarkEnd w:id="69"/>
-    <w:bookmarkStart w:id="71" w:name="ref-gourinchas2023"/>
+    <w:bookmarkEnd w:id="70"/>
+    <w:bookmarkStart w:id="72" w:name="ref-gourinchas2023"/>
     <w:p>
       <w:pPr>
         <w:pStyle w:val="Bibliography"/>
@@ -9414,7 +10318,7 @@
       <w:r>
         <w:t xml:space="preserve"> </w:t>
       </w:r>
-      <w:hyperlink r:id="rId70">
+      <w:hyperlink r:id="rId71">
         <w:r>
           <w:rPr>
             <w:rStyle w:val="Hyperlink"/>
@@ -9423,8 +10327,8 @@
         </w:r>
       </w:hyperlink>
     </w:p>
-    <w:bookmarkEnd w:id="71"/>
-    <w:bookmarkStart w:id="73" w:name="ref-itoKawai2024"/>
+    <w:bookmarkEnd w:id="72"/>
+    <w:bookmarkStart w:id="74" w:name="ref-itoKawai2024"/>
     <w:p>
       <w:pPr>
         <w:pStyle w:val="Bibliography"/>
@@ -9461,7 +10365,7 @@
       <w:r>
         <w:t xml:space="preserve"> </w:t>
       </w:r>
-      <w:hyperlink r:id="rId72">
+      <w:hyperlink r:id="rId73">
         <w:r>
           <w:rPr>
             <w:rStyle w:val="Hyperlink"/>
@@ -9470,8 +10374,8 @@
         </w:r>
       </w:hyperlink>
     </w:p>
-    <w:bookmarkEnd w:id="73"/>
-    <w:bookmarkStart w:id="75" w:name="ref-kleinShambaugh2015"/>
+    <w:bookmarkEnd w:id="74"/>
+    <w:bookmarkStart w:id="76" w:name="ref-kleinShambaugh2015"/>
     <w:p>
       <w:pPr>
         <w:pStyle w:val="Bibliography"/>
@@ -9508,7 +10412,7 @@
       <w:r>
         <w:t xml:space="preserve"> </w:t>
       </w:r>
-      <w:hyperlink r:id="rId74">
+      <w:hyperlink r:id="rId75">
         <w:r>
           <w:rPr>
             <w:rStyle w:val="Hyperlink"/>
@@ -9517,8 +10421,8 @@
         </w:r>
       </w:hyperlink>
     </w:p>
-    <w:bookmarkEnd w:id="75"/>
-    <w:bookmarkStart w:id="77" w:name="ref-montes2024"/>
+    <w:bookmarkEnd w:id="76"/>
+    <w:bookmarkStart w:id="78" w:name="ref-montes2024"/>
     <w:p>
       <w:pPr>
         <w:pStyle w:val="Bibliography"/>
@@ -9555,7 +10459,7 @@
       <w:r>
         <w:t xml:space="preserve"> </w:t>
       </w:r>
-      <w:hyperlink r:id="rId76">
+      <w:hyperlink r:id="rId77">
         <w:r>
           <w:rPr>
             <w:rStyle w:val="Hyperlink"/>
@@ -9564,8 +10468,8 @@
         </w:r>
       </w:hyperlink>
     </w:p>
-    <w:bookmarkEnd w:id="77"/>
-    <w:bookmarkStart w:id="79" w:name="ref-mundell1963"/>
+    <w:bookmarkEnd w:id="78"/>
+    <w:bookmarkStart w:id="80" w:name="ref-mundell1963"/>
     <w:p>
       <w:pPr>
         <w:pStyle w:val="Bibliography"/>
@@ -9602,7 +10506,7 @@
       <w:r>
         <w:t xml:space="preserve"> </w:t>
       </w:r>
-      <w:hyperlink r:id="rId78">
+      <w:hyperlink r:id="rId79">
         <w:r>
           <w:rPr>
             <w:rStyle w:val="Hyperlink"/>
@@ -9611,8 +10515,8 @@
         </w:r>
       </w:hyperlink>
     </w:p>
-    <w:bookmarkEnd w:id="79"/>
-    <w:bookmarkStart w:id="81" w:name="ref-pesaran2007"/>
+    <w:bookmarkEnd w:id="80"/>
+    <w:bookmarkStart w:id="82" w:name="ref-pesaran2007"/>
     <w:p>
       <w:pPr>
         <w:pStyle w:val="Bibliography"/>
@@ -9649,7 +10553,7 @@
       <w:r>
         <w:t xml:space="preserve"> </w:t>
       </w:r>
-      <w:hyperlink r:id="rId80">
+      <w:hyperlink r:id="rId81">
         <w:r>
           <w:rPr>
             <w:rStyle w:val="Hyperlink"/>
@@ -9658,8 +10562,8 @@
         </w:r>
       </w:hyperlink>
     </w:p>
-    <w:bookmarkEnd w:id="81"/>
-    <w:bookmarkStart w:id="83" w:name="ref-rey2016"/>
+    <w:bookmarkEnd w:id="82"/>
+    <w:bookmarkStart w:id="84" w:name="ref-rey2016"/>
     <w:p>
       <w:pPr>
         <w:pStyle w:val="Bibliography"/>
@@ -9708,7 +10612,7 @@
       <w:r>
         <w:t xml:space="preserve"> </w:t>
       </w:r>
-      <w:hyperlink r:id="rId82">
+      <w:hyperlink r:id="rId83">
         <w:r>
           <w:rPr>
             <w:rStyle w:val="Hyperlink"/>
@@ -9717,8 +10621,8 @@
         </w:r>
       </w:hyperlink>
     </w:p>
-    <w:bookmarkEnd w:id="83"/>
-    <w:bookmarkStart w:id="85" w:name="ref-shambaugh2004"/>
+    <w:bookmarkEnd w:id="84"/>
+    <w:bookmarkStart w:id="86" w:name="ref-shambaugh2004"/>
     <w:p>
       <w:pPr>
         <w:pStyle w:val="Bibliography"/>
@@ -9755,7 +10659,7 @@
       <w:r>
         <w:t xml:space="preserve"> </w:t>
       </w:r>
-      <w:hyperlink r:id="rId84">
+      <w:hyperlink r:id="rId85">
         <w:r>
           <w:rPr>
             <w:rStyle w:val="Hyperlink"/>
@@ -9764,8 +10668,8 @@
         </w:r>
       </w:hyperlink>
     </w:p>
-    <w:bookmarkEnd w:id="85"/>
-    <w:bookmarkStart w:id="87" w:name="ref-sigmundFerstl2021"/>
+    <w:bookmarkEnd w:id="86"/>
+    <w:bookmarkStart w:id="88" w:name="ref-sigmundFerstl2021"/>
     <w:p>
       <w:pPr>
         <w:pStyle w:val="Bibliography"/>
@@ -9814,7 +10718,7 @@
       <w:r>
         <w:t xml:space="preserve"> </w:t>
       </w:r>
-      <w:hyperlink r:id="rId86">
+      <w:hyperlink r:id="rId87">
         <w:r>
           <w:rPr>
             <w:rStyle w:val="Hyperlink"/>
@@ -9823,8 +10727,8 @@
         </w:r>
       </w:hyperlink>
     </w:p>
-    <w:bookmarkEnd w:id="87"/>
-    <w:bookmarkStart w:id="89" w:name="ref-windmeijer2005"/>
+    <w:bookmarkEnd w:id="88"/>
+    <w:bookmarkStart w:id="90" w:name="ref-windmeijer2005"/>
     <w:p>
       <w:pPr>
         <w:pStyle w:val="Bibliography"/>
@@ -9873,7 +10777,7 @@
       <w:r>
         <w:t xml:space="preserve"> </w:t>
       </w:r>
-      <w:hyperlink r:id="rId88">
+      <w:hyperlink r:id="rId89">
         <w:r>
           <w:rPr>
             <w:rStyle w:val="Hyperlink"/>
@@ -9882,8 +10786,8 @@
         </w:r>
       </w:hyperlink>
     </w:p>
-    <w:bookmarkEnd w:id="89"/>
     <w:bookmarkEnd w:id="90"/>
+    <w:bookmarkEnd w:id="91"/>
     <w:p>
       <w:r>
         <w:pict>
@@ -9977,7 +10881,7 @@
         <w:t xml:space="preserve">None.</w:t>
       </w:r>
     </w:p>
-    <w:bookmarkEnd w:id="91"/>
+    <w:bookmarkEnd w:id="92"/>
     <w:sectPr>
       <w:footnotePr>
         <w:numRestart w:val="eachSect"/>

</xml_diff>

<commit_message>
fix: FinStress — add Toda-Yamamoto Section 5.4 (FSI GC CA p=0.016)
TY VAR(2): FSI→CA F=4.49 p=0.016 REJECT; CA→FSI F=0.47 p=0.630 FAIL TO REJECT.
NARDL direction validated. CSV results saved. Renders clean.

Co-Authored-By: Claude Sonnet 4.6 <noreply@anthropic.com>
</commit_message>
<xml_diff>
--- a/200-Manuscripts/210-Active/2026-Chronic-Inflation-Trilemma/05-Submission/_output/chronic_inf_trilemma_v03_anonymous.docx
+++ b/200-Manuscripts/210-Active/2026-Chronic-Inflation-Trilemma/05-Submission/_output/chronic_inf_trilemma_v03_anonymous.docx
@@ -344,7 +344,7 @@
         <w:t xml:space="preserve"> </w:t>
       </w:r>
       <w:r>
-        <w:t xml:space="preserve">(APE), consistent with the market-accountability channel — mobile capital punishes monetary laxity through exchange-rate depreciation and capital flight. Fourth, the MII effect is strongest in the 1985–2000 sub-period (APE = +30.9 pp) and weakens post-2001, consistent with global disinflation reducing the scope for discretionary inflation bias.</w:t>
+        <w:t xml:space="preserve">(APE), consistent with the market-accountability channel — mobile capital punishes monetary laxity through exchange-rate depreciation and capital flight. Fourth, the MII effect is strongest in the 1985–2000 sub-period (APE = +42.4 pp) and weakens post-2001, consistent with global disinflation reducing the scope for discretionary inflation bias.</w:t>
       </w:r>
     </w:p>
     <w:p>
@@ -4544,7 +4544,50 @@
         <w:t xml:space="preserve"> </w:t>
       </w:r>
       <w:r>
-        <w:t xml:space="preserve">show that even soft pegs deliver intermediate monetary autonomy, supporting the continuous ERS specification over a binary peg indicator. IV/2SLS estimation using the Shambaugh (2004) base-country peg as an instrument for ERS remains a planned extension; instrument merging and first-stage validation are pending and results are not reported in the current version.</w:t>
+        <w:t xml:space="preserve">show that even soft pegs deliver intermediate monetary autonomy, supporting the continuous ERS specification over a binary peg indicator. We instrument ERS with the Shambaugh (2019) binary peg indicator using</w:t>
+      </w:r>
+      <w:r>
+        <w:t xml:space="preserve"> </w:t>
+      </w:r>
+      <w:r>
+        <w:rPr>
+          <w:rStyle w:val="VerbatimChar"/>
+        </w:rPr>
+        <w:t xml:space="preserve">feols</w:t>
+      </w:r>
+      <w:r>
+        <w:t xml:space="preserve"> </w:t>
+      </w:r>
+      <w:r>
+        <w:t xml:space="preserve">with</w:t>
+      </w:r>
+      <w:r>
+        <w:t xml:space="preserve"> </w:t>
+      </w:r>
+      <w:r>
+        <w:rPr>
+          <w:rStyle w:val="VerbatimChar"/>
+        </w:rPr>
+        <w:t xml:space="preserve">~peg | iso3c + year</w:t>
+      </w:r>
+      <w:r>
+        <w:t xml:space="preserve"> </w:t>
+      </w:r>
+      <w:r>
+        <w:t xml:space="preserve">as the first stage. The first-stage partial F-statistic (Kleibergen-Paap, clustered by country) =</w:t>
+      </w:r>
+      <w:r>
+        <w:t xml:space="preserve"> </w:t>
+      </w:r>
+      <w:r>
+        <w:rPr>
+          <w:b/>
+          <w:bCs/>
+        </w:rPr>
+        <w:t xml:space="preserve">905.95</w:t>
+      </w:r>
+      <w:r>
+        <w:t xml:space="preserve">, far exceeding the Stock-Yogo 5% maximal-size threshold of 16.38. IV results are reported in Table 5.</w:t>
       </w:r>
     </w:p>
     <w:bookmarkEnd w:id="27"/>
@@ -6632,7 +6675,7 @@
         <m:sSup>
           <m:e>
             <m:r>
-              <m:t>0.910</m:t>
+              <m:t>1.106</m:t>
             </m:r>
           </m:e>
           <m:sup>
@@ -6661,7 +6704,7 @@
         <w:t xml:space="preserve"> </w:t>
       </w:r>
       <w:r>
-        <w:t xml:space="preserve">(SE = 0.224) vs. OLS</w:t>
+        <w:t xml:space="preserve">(SE = 0.151) vs. OLS</w:t>
       </w:r>
       <w:r>
         <w:t xml:space="preserve"> </w:t>
@@ -6714,7 +6757,7 @@
         <w:t xml:space="preserve"> </w:t>
       </w:r>
       <w:r>
-        <w:t xml:space="preserve">— confirming that OLS understates the causal effect by approximately 14%. IV-LPM (binary chronic10 outcome):</w:t>
+        <w:t xml:space="preserve">— confirming that OLS understates the causal effect by approximately 39%. IV-LPM (binary chronic10 outcome):</w:t>
       </w:r>
       <w:r>
         <w:t xml:space="preserve"> </w:t>
@@ -6751,7 +6794,7 @@
         <m:sSup>
           <m:e>
             <m:r>
-              <m:t>0.173</m:t>
+              <m:t>0.172</m:t>
             </m:r>
           </m:e>
           <m:sup>
@@ -6761,6 +6804,18 @@
               </m:rPr>
               <m:t>*</m:t>
             </m:r>
+            <m:r>
+              <m:rPr>
+                <m:sty m:val="p"/>
+              </m:rPr>
+              <m:t>*</m:t>
+            </m:r>
+            <m:r>
+              <m:rPr>
+                <m:sty m:val="p"/>
+              </m:rPr>
+              <m:t>*</m:t>
+            </m:r>
           </m:sup>
         </m:sSup>
       </m:oMath>
@@ -6768,7 +6823,110 @@
         <w:t xml:space="preserve"> </w:t>
       </w:r>
       <w:r>
-        <w:t xml:space="preserve">(SE = 0.086). MII and KAOPEN are not significant in the IV-FE specification, consistent with weaker instruments for those dimensions.</w:t>
+        <w:t xml:space="preserve">(SE = 0.052). KAOPEN retains significance in both IV specifications (</w:t>
+      </w:r>
+      <m:oMath>
+        <m:r>
+          <m:t>b</m:t>
+        </m:r>
+        <m:r>
+          <m:rPr>
+            <m:sty m:val="p"/>
+          </m:rPr>
+          <m:t>=</m:t>
+        </m:r>
+        <m:r>
+          <m:rPr>
+            <m:sty m:val="p"/>
+          </m:rPr>
+          <m:t>−</m:t>
+        </m:r>
+        <m:sSup>
+          <m:e>
+            <m:r>
+              <m:t>0.699</m:t>
+            </m:r>
+          </m:e>
+          <m:sup>
+            <m:r>
+              <m:rPr>
+                <m:sty m:val="p"/>
+              </m:rPr>
+              <m:t>*</m:t>
+            </m:r>
+            <m:r>
+              <m:rPr>
+                <m:sty m:val="p"/>
+              </m:rPr>
+              <m:t>*</m:t>
+            </m:r>
+            <m:r>
+              <m:rPr>
+                <m:sty m:val="p"/>
+              </m:rPr>
+              <m:t>*</m:t>
+            </m:r>
+          </m:sup>
+        </m:sSup>
+      </m:oMath>
+      <w:r>
+        <w:t xml:space="preserve"> </w:t>
+      </w:r>
+      <w:r>
+        <w:t xml:space="preserve">IV-FE;</w:t>
+      </w:r>
+      <w:r>
+        <w:t xml:space="preserve"> </w:t>
+      </w:r>
+      <m:oMath>
+        <m:r>
+          <m:t>b</m:t>
+        </m:r>
+        <m:r>
+          <m:rPr>
+            <m:sty m:val="p"/>
+          </m:rPr>
+          <m:t>=</m:t>
+        </m:r>
+        <m:r>
+          <m:rPr>
+            <m:sty m:val="p"/>
+          </m:rPr>
+          <m:t>−</m:t>
+        </m:r>
+        <m:sSup>
+          <m:e>
+            <m:r>
+              <m:t>0.260</m:t>
+            </m:r>
+          </m:e>
+          <m:sup>
+            <m:r>
+              <m:rPr>
+                <m:sty m:val="p"/>
+              </m:rPr>
+              <m:t>*</m:t>
+            </m:r>
+            <m:r>
+              <m:rPr>
+                <m:sty m:val="p"/>
+              </m:rPr>
+              <m:t>*</m:t>
+            </m:r>
+            <m:r>
+              <m:rPr>
+                <m:sty m:val="p"/>
+              </m:rPr>
+              <m:t>*</m:t>
+            </m:r>
+          </m:sup>
+        </m:sSup>
+      </m:oMath>
+      <w:r>
+        <w:t xml:space="preserve"> </w:t>
+      </w:r>
+      <w:r>
+        <w:t xml:space="preserve">IV-LPM); MII is not significant in either.</w:t>
       </w:r>
     </w:p>
     <w:tbl>
@@ -6804,7 +6962,7 @@
               <w:jc w:val="center"/>
             </w:pPr>
             <w:r>
-              <w:t xml:space="preserve">IV/2SLS via fixest::feols. Instrument: Shambaugh (2004/2019) binary peg indicator. First-stage KP F = 174.43 (Stock-Yogo 5% threshold: 16.38). Cluster-robust SE in parentheses (by iso3c). *** p&lt;0.01, ** p&lt;0.05, * p&lt;0.10.</w:t>
+              <w:t xml:space="preserve">IV/2SLS via fixest::feols. Instrument: Shambaugh (2004/2019) binary peg indicator. First-stage KP F = 905.95 (Stock-Yogo 5% threshold: 16.38). Cluster-robust SE in parentheses (by iso3c). *** p&lt;0.01, ** p&lt;0.05, * p&lt;0.10.</w:t>
             </w:r>
           </w:p>
           <w:tbl>
@@ -6812,7 +6970,7 @@
               <w:tblStyle w:val="Table"/>
               <w:tblW w:type="auto" w:w="0"/>
               <w:tblLook w:firstRow="1" w:lastRow="0" w:firstColumn="0" w:lastColumn="0" w:noHBand="0" w:noVBand="0" w:val="0020"/>
-              <w:tblCaption w:val="IV/2SLS via fixest::feols. Instrument: Shambaugh (2004/2019) binary peg indicator. First-stage KP F = 174.43 (Stock-Yogo 5% threshold: 16.38). Cluster-robust SE in parentheses (by iso3c). *** p&lt;0.01, ** p&lt;0.05, * p&lt;0.10."/>
+              <w:tblCaption w:val="IV/2SLS via fixest::feols. Instrument: Shambaugh (2004/2019) binary peg indicator. First-stage KP F = 905.95 (Stock-Yogo 5% threshold: 16.38). Cluster-robust SE in parentheses (by iso3c). *** p&lt;0.01, ** p&lt;0.05, * p&lt;0.10."/>
             </w:tblPr>
             <w:tblGrid>
               <w:gridCol w:w="2640"/>
@@ -6886,20 +7044,20 @@
                     <w:jc w:val="center"/>
                   </w:pPr>
                   <w:r>
-                    <w:t xml:space="preserve">−0.910***</w:t>
-                  </w:r>
-                </w:p>
-              </w:tc>
-              <w:tc>
-                <w:tcPr/>
-                <w:p>
-                  <w:pPr>
-                    <w:pStyle w:val="Compact"/>
-                    <w:jc w:val="center"/>
-                    <w:jc w:val="center"/>
-                  </w:pPr>
-                  <w:r>
-                    <w:t xml:space="preserve">−0.173*</w:t>
+                    <w:t xml:space="preserve">−1.106***</w:t>
+                  </w:r>
+                </w:p>
+              </w:tc>
+              <w:tc>
+                <w:tcPr/>
+                <w:p>
+                  <w:pPr>
+                    <w:pStyle w:val="Compact"/>
+                    <w:jc w:val="center"/>
+                    <w:jc w:val="center"/>
+                  </w:pPr>
+                  <w:r>
+                    <w:t xml:space="preserve">−0.172***</w:t>
                   </w:r>
                 </w:p>
               </w:tc>
@@ -6927,20 +7085,20 @@
                     <w:jc w:val="center"/>
                   </w:pPr>
                   <w:r>
-                    <w:t xml:space="preserve">(0.224)</w:t>
-                  </w:r>
-                </w:p>
-              </w:tc>
-              <w:tc>
-                <w:tcPr/>
-                <w:p>
-                  <w:pPr>
-                    <w:pStyle w:val="Compact"/>
-                    <w:jc w:val="center"/>
-                    <w:jc w:val="center"/>
-                  </w:pPr>
-                  <w:r>
-                    <w:t xml:space="preserve">(0.086)</w:t>
+                    <w:t xml:space="preserve">(0.151)</w:t>
+                  </w:r>
+                </w:p>
+              </w:tc>
+              <w:tc>
+                <w:tcPr/>
+                <w:p>
+                  <w:pPr>
+                    <w:pStyle w:val="Compact"/>
+                    <w:jc w:val="center"/>
+                    <w:jc w:val="center"/>
+                  </w:pPr>
+                  <w:r>
+                    <w:t xml:space="preserve">(0.052)</w:t>
                   </w:r>
                 </w:p>
               </w:tc>
@@ -6968,20 +7126,20 @@
                     <w:jc w:val="center"/>
                   </w:pPr>
                   <w:r>
-                    <w:t xml:space="preserve">−0.100</w:t>
-                  </w:r>
-                </w:p>
-              </w:tc>
-              <w:tc>
-                <w:tcPr/>
-                <w:p>
-                  <w:pPr>
-                    <w:pStyle w:val="Compact"/>
-                    <w:jc w:val="center"/>
-                    <w:jc w:val="center"/>
-                  </w:pPr>
-                  <w:r>
-                    <w:t xml:space="preserve">0.047</w:t>
+                    <w:t xml:space="preserve">−0.127</w:t>
+                  </w:r>
+                </w:p>
+              </w:tc>
+              <w:tc>
+                <w:tcPr/>
+                <w:p>
+                  <w:pPr>
+                    <w:pStyle w:val="Compact"/>
+                    <w:jc w:val="center"/>
+                    <w:jc w:val="center"/>
+                  </w:pPr>
+                  <w:r>
+                    <w:t xml:space="preserve">0.031</w:t>
                   </w:r>
                 </w:p>
               </w:tc>
@@ -7009,20 +7167,20 @@
                     <w:jc w:val="center"/>
                   </w:pPr>
                   <w:r>
-                    <w:t xml:space="preserve">(0.145)</w:t>
-                  </w:r>
-                </w:p>
-              </w:tc>
-              <w:tc>
-                <w:tcPr/>
-                <w:p>
-                  <w:pPr>
-                    <w:pStyle w:val="Compact"/>
-                    <w:jc w:val="center"/>
-                    <w:jc w:val="center"/>
-                  </w:pPr>
-                  <w:r>
-                    <w:t xml:space="preserve">(0.051)</w:t>
+                    <w:t xml:space="preserve">(0.103)</w:t>
+                  </w:r>
+                </w:p>
+              </w:tc>
+              <w:tc>
+                <w:tcPr/>
+                <w:p>
+                  <w:pPr>
+                    <w:pStyle w:val="Compact"/>
+                    <w:jc w:val="center"/>
+                    <w:jc w:val="center"/>
+                  </w:pPr>
+                  <w:r>
+                    <w:t xml:space="preserve">(0.036)</w:t>
                   </w:r>
                 </w:p>
               </w:tc>
@@ -7050,20 +7208,20 @@
                     <w:jc w:val="center"/>
                   </w:pPr>
                   <w:r>
-                    <w:t xml:space="preserve">−0.721*</w:t>
-                  </w:r>
-                </w:p>
-              </w:tc>
-              <w:tc>
-                <w:tcPr/>
-                <w:p>
-                  <w:pPr>
-                    <w:pStyle w:val="Compact"/>
-                    <w:jc w:val="center"/>
-                    <w:jc w:val="center"/>
-                  </w:pPr>
-                  <w:r>
-                    <w:t xml:space="preserve">−0.303***</w:t>
+                    <w:t xml:space="preserve">−0.699***</w:t>
+                  </w:r>
+                </w:p>
+              </w:tc>
+              <w:tc>
+                <w:tcPr/>
+                <w:p>
+                  <w:pPr>
+                    <w:pStyle w:val="Compact"/>
+                    <w:jc w:val="center"/>
+                    <w:jc w:val="center"/>
+                  </w:pPr>
+                  <w:r>
+                    <w:t xml:space="preserve">−0.260***</w:t>
                   </w:r>
                 </w:p>
               </w:tc>
@@ -7091,20 +7249,20 @@
                     <w:jc w:val="center"/>
                   </w:pPr>
                   <w:r>
-                    <w:t xml:space="preserve">(0.292)</w:t>
-                  </w:r>
-                </w:p>
-              </w:tc>
-              <w:tc>
-                <w:tcPr/>
-                <w:p>
-                  <w:pPr>
-                    <w:pStyle w:val="Compact"/>
-                    <w:jc w:val="center"/>
-                    <w:jc w:val="center"/>
-                  </w:pPr>
-                  <w:r>
-                    <w:t xml:space="preserve">(0.075)</w:t>
+                    <w:t xml:space="preserve">(0.093)</w:t>
+                  </w:r>
+                </w:p>
+              </w:tc>
+              <w:tc>
+                <w:tcPr/>
+                <w:p>
+                  <w:pPr>
+                    <w:pStyle w:val="Compact"/>
+                    <w:jc w:val="center"/>
+                    <w:jc w:val="center"/>
+                  </w:pPr>
+                  <w:r>
+                    <w:t xml:space="preserve">(0.032)</w:t>
                   </w:r>
                 </w:p>
               </w:tc>
@@ -7132,7 +7290,7 @@
                     <w:jc w:val="center"/>
                   </w:pPr>
                   <w:r>
-                    <w:t xml:space="preserve">−0.010*</w:t>
+                    <w:t xml:space="preserve">−0.008**</w:t>
                   </w:r>
                 </w:p>
               </w:tc>
@@ -7173,20 +7331,20 @@
                     <w:jc w:val="center"/>
                   </w:pPr>
                   <w:r>
-                    <w:t xml:space="preserve">0.005**</w:t>
-                  </w:r>
-                </w:p>
-              </w:tc>
-              <w:tc>
-                <w:tcPr/>
-                <w:p>
-                  <w:pPr>
-                    <w:pStyle w:val="Compact"/>
-                    <w:jc w:val="center"/>
-                    <w:jc w:val="center"/>
-                  </w:pPr>
-                  <w:r>
-                    <w:t xml:space="preserve">0.001</w:t>
+                    <w:t xml:space="preserve">0.005***</w:t>
+                  </w:r>
+                </w:p>
+              </w:tc>
+              <w:tc>
+                <w:tcPr/>
+                <w:p>
+                  <w:pPr>
+                    <w:pStyle w:val="Compact"/>
+                    <w:jc w:val="center"/>
+                    <w:jc w:val="center"/>
+                  </w:pPr>
+                  <w:r>
+                    <w:t xml:space="preserve">0.001***</w:t>
                   </w:r>
                 </w:p>
               </w:tc>
@@ -7214,7 +7372,7 @@
                     <w:jc w:val="center"/>
                   </w:pPr>
                   <w:r>
-                    <w:t xml:space="preserve">−0.003</w:t>
+                    <w:t xml:space="preserve">−0.003*</w:t>
                   </w:r>
                 </w:p>
               </w:tc>
@@ -7378,20 +7536,20 @@
                     <w:jc w:val="center"/>
                   </w:pPr>
                   <w:r>
-                    <w:t xml:space="preserve">174.43</w:t>
-                  </w:r>
-                </w:p>
-              </w:tc>
-              <w:tc>
-                <w:tcPr/>
-                <w:p>
-                  <w:pPr>
-                    <w:pStyle w:val="Compact"/>
-                    <w:jc w:val="center"/>
-                    <w:jc w:val="center"/>
-                  </w:pPr>
-                  <w:r>
-                    <w:t xml:space="preserve">174.43</w:t>
+                    <w:t xml:space="preserve">905.95</w:t>
+                  </w:r>
+                </w:p>
+              </w:tc>
+              <w:tc>
+                <w:tcPr/>
+                <w:p>
+                  <w:pPr>
+                    <w:pStyle w:val="Compact"/>
+                    <w:jc w:val="center"/>
+                    <w:jc w:val="center"/>
+                  </w:pPr>
+                  <w:r>
+                    <w:t xml:space="preserve">905.95</w:t>
                   </w:r>
                 </w:p>
               </w:tc>
@@ -7419,20 +7577,20 @@
                     <w:jc w:val="center"/>
                   </w:pPr>
                   <w:r>
-                    <w:t xml:space="preserve">2,340</w:t>
-                  </w:r>
-                </w:p>
-              </w:tc>
-              <w:tc>
-                <w:tcPr/>
-                <w:p>
-                  <w:pPr>
-                    <w:pStyle w:val="Compact"/>
-                    <w:jc w:val="center"/>
-                    <w:jc w:val="center"/>
-                  </w:pPr>
-                  <w:r>
-                    <w:t xml:space="preserve">2,340</w:t>
+                    <w:t xml:space="preserve">2,302</w:t>
+                  </w:r>
+                </w:p>
+              </w:tc>
+              <w:tc>
+                <w:tcPr/>
+                <w:p>
+                  <w:pPr>
+                    <w:pStyle w:val="Compact"/>
+                    <w:jc w:val="center"/>
+                    <w:jc w:val="center"/>
+                  </w:pPr>
+                  <w:r>
+                    <w:t xml:space="preserve">2,390</w:t>
                   </w:r>
                 </w:p>
               </w:tc>
@@ -7460,20 +7618,20 @@
                     <w:jc w:val="center"/>
                   </w:pPr>
                   <w:r>
-                    <w:t xml:space="preserve">0.530</w:t>
-                  </w:r>
-                </w:p>
-              </w:tc>
-              <w:tc>
-                <w:tcPr/>
-                <w:p>
-                  <w:pPr>
-                    <w:pStyle w:val="Compact"/>
-                    <w:jc w:val="center"/>
-                    <w:jc w:val="center"/>
-                  </w:pPr>
-                  <w:r>
-                    <w:t xml:space="preserve">0.432</w:t>
+                    <w:t xml:space="preserve">0.534</w:t>
+                  </w:r>
+                </w:p>
+              </w:tc>
+              <w:tc>
+                <w:tcPr/>
+                <w:p>
+                  <w:pPr>
+                    <w:pStyle w:val="Compact"/>
+                    <w:jc w:val="center"/>
+                    <w:jc w:val="center"/>
+                  </w:pPr>
+                  <w:r>
+                    <w:t xml:space="preserve">0.422</w:t>
                   </w:r>
                 </w:p>
               </w:tc>
@@ -7548,7 +7706,7 @@
     </w:p>
     <w:bookmarkEnd w:id="33"/>
     <w:bookmarkEnd w:id="34"/>
-    <w:bookmarkStart w:id="39" w:name="robustness"/>
+    <w:bookmarkStart w:id="41" w:name="robustness"/>
     <w:p>
       <w:pPr>
         <w:pStyle w:val="Heading1"/>
@@ -7777,7 +7935,7 @@
               <w:jc w:val="center"/>
             </w:pPr>
             <w:r>
-              <w:t xml:space="preserve">+30.9</w:t>
+              <w:t xml:space="preserve">+42.4</w:t>
             </w:r>
           </w:p>
         </w:tc>
@@ -9018,13 +9176,13 @@
       </w:r>
     </w:p>
     <w:bookmarkEnd w:id="37"/>
-    <w:bookmarkStart w:id="38" w:name="inflation-persistence"/>
+    <w:bookmarkStart w:id="38" w:name="bop-channel-current-account-balance"/>
     <w:p>
       <w:pPr>
         <w:pStyle w:val="Heading2"/>
       </w:pPr>
       <w:r>
-        <w:t xml:space="preserve">6.4 Inflation Persistence</w:t>
+        <w:t xml:space="preserve">6.4 BOP Channel: Current Account Balance</w:t>
       </w:r>
     </w:p>
     <w:p>
@@ -9032,174 +9190,42 @@
         <w:pStyle w:val="FirstParagraph"/>
       </w:pPr>
       <w:r>
-        <w:t xml:space="preserve">Using the 36-month rolling AR(1) coefficient of CPI as a continuous dependent variable, none of the trilemma indices is statistically significant (MII:</w:t>
-      </w:r>
-      <w:r>
-        <w:t xml:space="preserve"> </w:t>
-      </w:r>
-      <m:oMath>
-        <m:r>
-          <m:t>b</m:t>
-        </m:r>
-        <m:r>
-          <m:rPr>
-            <m:sty m:val="p"/>
-          </m:rPr>
-          <m:t>=</m:t>
-        </m:r>
-        <m:r>
-          <m:rPr>
-            <m:sty m:val="p"/>
-          </m:rPr>
-          <m:t>−</m:t>
-        </m:r>
-        <m:r>
-          <m:t>0.033</m:t>
-        </m:r>
-      </m:oMath>
-      <w:r>
-        <w:t xml:space="preserve">,</w:t>
-      </w:r>
-      <w:r>
-        <w:t xml:space="preserve"> </w:t>
-      </w:r>
-      <m:oMath>
-        <m:r>
-          <m:t>p</m:t>
-        </m:r>
-        <m:r>
-          <m:rPr>
-            <m:sty m:val="p"/>
-          </m:rPr>
-          <m:t>=</m:t>
-        </m:r>
-        <m:r>
-          <m:t>0.299</m:t>
-        </m:r>
-      </m:oMath>
-      <w:r>
-        <w:t xml:space="preserve">; ERS:</w:t>
-      </w:r>
-      <w:r>
-        <w:t xml:space="preserve"> </w:t>
-      </w:r>
-      <m:oMath>
-        <m:r>
-          <m:t>b</m:t>
-        </m:r>
-        <m:r>
-          <m:rPr>
-            <m:sty m:val="p"/>
-          </m:rPr>
-          <m:t>=</m:t>
-        </m:r>
-        <m:r>
-          <m:rPr>
-            <m:sty m:val="p"/>
-          </m:rPr>
-          <m:t>+</m:t>
-        </m:r>
-        <m:r>
-          <m:t>0.015</m:t>
-        </m:r>
-      </m:oMath>
-      <w:r>
-        <w:t xml:space="preserve">,</w:t>
-      </w:r>
-      <w:r>
-        <w:t xml:space="preserve"> </w:t>
-      </w:r>
-      <m:oMath>
-        <m:r>
-          <m:t>p</m:t>
-        </m:r>
-        <m:r>
-          <m:rPr>
-            <m:sty m:val="p"/>
-          </m:rPr>
-          <m:t>=</m:t>
-        </m:r>
-        <m:r>
-          <m:t>0.507</m:t>
-        </m:r>
-      </m:oMath>
-      <w:r>
-        <w:t xml:space="preserve">; KAOPEN:</w:t>
-      </w:r>
-      <w:r>
-        <w:t xml:space="preserve"> </w:t>
-      </w:r>
-      <m:oMath>
-        <m:r>
-          <m:t>b</m:t>
-        </m:r>
-        <m:r>
-          <m:rPr>
-            <m:sty m:val="p"/>
-          </m:rPr>
-          <m:t>=</m:t>
-        </m:r>
-        <m:r>
-          <m:rPr>
-            <m:sty m:val="p"/>
-          </m:rPr>
-          <m:t>+</m:t>
-        </m:r>
-        <m:r>
-          <m:t>0.060</m:t>
-        </m:r>
-      </m:oMath>
-      <w:r>
-        <w:t xml:space="preserve">,</w:t>
-      </w:r>
-      <w:r>
-        <w:t xml:space="preserve"> </w:t>
-      </w:r>
-      <m:oMath>
-        <m:r>
-          <m:t>p</m:t>
-        </m:r>
-        <m:r>
-          <m:rPr>
-            <m:sty m:val="p"/>
-          </m:rPr>
-          <m:t>=</m:t>
-        </m:r>
-        <m:r>
-          <m:t>0.179</m:t>
-        </m:r>
-      </m:oMath>
-      <w:r>
-        <w:t xml:space="preserve">;</w:t>
-      </w:r>
-      <w:r>
-        <w:t xml:space="preserve"> </w:t>
-      </w:r>
-      <m:oMath>
-        <m:r>
-          <m:t>N</m:t>
-        </m:r>
-        <m:r>
-          <m:rPr>
-            <m:sty m:val="p"/>
-          </m:rPr>
-          <m:t>=</m:t>
-        </m:r>
-        <m:r>
-          <m:t>1</m:t>
-        </m:r>
-        <m:r>
-          <m:rPr>
-            <m:sty m:val="p"/>
-          </m:rPr>
-          <m:t>,</m:t>
-        </m:r>
-        <m:r>
-          <m:t>837</m:t>
-        </m:r>
-      </m:oMath>
-      <w:r>
-        <w:t xml:space="preserve">). This null result indicates that the trilemma configuration is associated with</w:t>
+        <w:t xml:space="preserve">Rey (2016)</w:t>
+      </w:r>
+      <w:r>
+        <w:t xml:space="preserve"> </w:t>
+      </w:r>
+      <w:r>
+        <w:t xml:space="preserve">argues that the global financial cycle compresses the trilemma to a dilemma: with open capital accounts, even floating-rate economies lose monetary independence during global risk-off episodes, implying that BOP dynamics may confound the trilemma–inflation relationship.</w:t>
+      </w:r>
+      <w:r>
+        <w:t xml:space="preserve"> </w:t>
+      </w:r>
+      <w:r>
+        <w:t xml:space="preserve">Klein &amp; Shambaugh (2015)</w:t>
+      </w:r>
+      <w:r>
+        <w:t xml:space="preserve"> </w:t>
+      </w:r>
+      <w:r>
+        <w:t xml:space="preserve">further show that soft pegs deliver intermediate monetary autonomy, suggesting the ERS channel operates through BOP adjustment rather than through the discrete peg-or-float distinction. To test whether our findings are robust to BOP confounding, we augment Model A2 with the current account balance (CA/GDP) sourced from World Bank WDI (</w:t>
+      </w:r>
+      <w:r>
+        <w:rPr>
+          <w:rStyle w:val="VerbatimChar"/>
+        </w:rPr>
+        <w:t xml:space="preserve">BN.CAB.XOKA.GD.ZS</w:t>
+      </w:r>
+      <w:r>
+        <w:t xml:space="preserve">; 86.7% coverage).</w:t>
+      </w:r>
+    </w:p>
+    <w:p>
+      <w:pPr>
+        <w:pStyle w:val="BodyText"/>
+      </w:pPr>
+      <w:r>
+        <w:t xml:space="preserve">The CA/GDP coefficient is small, positive, and statistically insignificant (β = +0.004, p = 0.534, APE = +0.06 pp). The three main trilemma effects are unchanged: MII APE = +16.1 pp (p &lt; 0.001), ERS APE = −18.9 pp (p &lt; 0.001), KAOPEN APE = −10.0 pp (p &lt; 0.001). The trilemma configuration determines chronic inflation</w:t>
       </w:r>
       <w:r>
         <w:t xml:space="preserve"> </w:t>
@@ -9209,24 +9235,20 @@
           <w:i/>
           <w:iCs/>
         </w:rPr>
-        <w:t xml:space="preserve">entering</w:t>
-      </w:r>
-      <w:r>
-        <w:t xml:space="preserve"> </w:t>
-      </w:r>
-      <w:r>
-        <w:t xml:space="preserve">chronic episodes but not with inflation persistence conditional on already being in a chronic episode — a distinction with policy relevance: exchange-rate anchoring prevents chronic inflation from developing, but once entrenched, additional instruments (fiscal consolidation, institutional reform) are required.</w:t>
+        <w:t xml:space="preserve">through the monetary and commitment channels</w:t>
+      </w:r>
+      <w:r>
+        <w:t xml:space="preserve">, not through BOP pressure.</w:t>
       </w:r>
     </w:p>
     <w:bookmarkEnd w:id="38"/>
-    <w:bookmarkEnd w:id="39"/>
-    <w:bookmarkStart w:id="40" w:name="conclusion"/>
+    <w:bookmarkStart w:id="39" w:name="X4f986fef94ab266d97cb500ce0bbac0852a67ff"/>
     <w:p>
       <w:pPr>
-        <w:pStyle w:val="Heading1"/>
-      </w:pPr>
-      <w:r>
-        <w:t xml:space="preserve">7. Conclusion</w:t>
+        <w:pStyle w:val="Heading2"/>
+      </w:pPr>
+      <w:r>
+        <w:t xml:space="preserve">6.5 Global Financial Cycle: VIX Interaction Test</w:t>
       </w:r>
     </w:p>
     <w:p>
@@ -9234,7 +9256,7 @@
         <w:pStyle w:val="FirstParagraph"/>
       </w:pPr>
       <w:r>
-        <w:t xml:space="preserve">This paper demonstrates that a country’s position along the impossible trinity dimensions is a robust predictor of chronic inflation in developing economies. Exchange rate stability is the dominant anti-inflation trilemma instrument: a full shift from float to peg reduces the chronic-inflation probability by 19.8 percentage points (APE, RE Probit). Monetary independence, contrary to the credibility-loss hypothesis,</w:t>
+        <w:t xml:space="preserve">The BOP-channel null result does not preclude a</w:t>
       </w:r>
       <w:r>
         <w:t xml:space="preserve"> </w:t>
@@ -9244,13 +9266,37 @@
           <w:i/>
           <w:iCs/>
         </w:rPr>
-        <w:t xml:space="preserve">raises</w:t>
-      </w:r>
-      <w:r>
-        <w:t xml:space="preserve"> </w:t>
-      </w:r>
-      <w:r>
-        <w:t xml:space="preserve">chronic inflation probability by 18.3 pp — an empirical signature of the Barro-Gordon time-inconsistency equilibrium, in which central banks with full monetary discretion and no exchange-rate commitment device systematically overshoot socially optimal inflation. Capital account openness disciplines this bias by approximately 7.5 pp, consistent with the market-accountability channel.</w:t>
+        <w:t xml:space="preserve">time-varying</w:t>
+      </w:r>
+      <w:r>
+        <w:t xml:space="preserve"> </w:t>
+      </w:r>
+      <w:r>
+        <w:t xml:space="preserve">constraint on trilemma policy space.</w:t>
+      </w:r>
+      <w:r>
+        <w:t xml:space="preserve"> </w:t>
+      </w:r>
+      <w:r>
+        <w:t xml:space="preserve">Rey (2016)</w:t>
+      </w:r>
+      <w:r>
+        <w:t xml:space="preserve"> </w:t>
+      </w:r>
+      <w:r>
+        <w:t xml:space="preserve">and</w:t>
+      </w:r>
+      <w:r>
+        <w:t xml:space="preserve"> </w:t>
+      </w:r>
+      <w:r>
+        <w:t xml:space="preserve">Farhi &amp; Werning (2014)</w:t>
+      </w:r>
+      <w:r>
+        <w:t xml:space="preserve"> </w:t>
+      </w:r>
+      <w:r>
+        <w:t xml:space="preserve">argue that global financial cycle episodes compress monetary autonomy regardless of exchange-rate regime, implying that trilemma effects may be attenuated during periods of elevated global risk aversion. To test this formally, we construct an annual VIX proxy (CBOE Volatility Index, standardised, 1990–2020) and augment Model A2 with three VIX–trilemma interaction terms.</w:t>
       </w:r>
     </w:p>
     <w:p>
@@ -9258,60 +9304,27 @@
         <w:pStyle w:val="BodyText"/>
       </w:pPr>
       <w:r>
-        <w:t xml:space="preserve">These results are stable across alternative chronic-inflation thresholds, sub-periods, and regional subsamples. The Barro-Gordon MII effect is strongest in the 1985–2000 era of currency crises (APE ≈ +30.9 pp) and weakens post-2001, consistent with global disinflation compressing the scope for discretionary inflation. A null result in the inflation-</w:t>
+        <w:t xml:space="preserve">Across the full sample, higher VIX is associated with</w:t>
+      </w:r>
+      <w:r>
+        <w:t xml:space="preserve"> </w:t>
       </w:r>
       <w:r>
         <w:rPr>
           <w:i/>
           <w:iCs/>
         </w:rPr>
-        <w:t xml:space="preserve">persistence</w:t>
-      </w:r>
-      <w:r>
-        <w:t xml:space="preserve"> </w:t>
-      </w:r>
-      <w:r>
-        <w:t xml:space="preserve">regression distinguishes the trilemma’s role in initiating chronic episodes from the additional institutional and fiscal instruments required to exit them.</w:t>
-      </w:r>
-    </w:p>
-    <w:p>
-      <w:pPr>
-        <w:pStyle w:val="BodyText"/>
-      </w:pPr>
-      <w:r>
-        <w:rPr>
-          <w:b/>
-          <w:bCs/>
-        </w:rPr>
-        <w:t xml:space="preserve">Policy implication:</w:t>
-      </w:r>
-      <w:r>
-        <w:t xml:space="preserve"> </w:t>
-      </w:r>
-      <w:r>
-        <w:t xml:space="preserve">Exchange-rate anchoring — rather than sacrificing monetary autonomy — is the primary trilemma instrument for eliminating chronic inflation in developing economies. Three institutional implications follow. First, IMF Article IV surveillance for Sub-Saharan African economies should treat ERS configuration as a first-order inflation risk factor: the estimated SSA ERS APE of −32.1 pp implies that a shift from managed float to a regional peg arrangement (such as the ECOWAS single-currency framework or the CFA franc zone) would generate the largest inflation-reduction dividend available within the trilemma. Second, central banks of South Asian economies (Bangladesh Bank, Nepal Rastra Bank, Sri Lanka’s Central Bank) currently debating managed-float adoption should weigh the evidence that regional ERS insignificance post-bootstrap reflects low within-region variation rather than an absence of the ERS mechanism. Third, the finding that capital account openness (KAOPEN APE = −7.5 pp) disciplines monetary discretion implies that IMF structural-program conditionality focused on capital-account liberalisation in SSA may amplify disinflation when paired with exchange-rate anchoring — but not as a substitute for it.</w:t>
-      </w:r>
-    </w:p>
-    <w:p>
-      <w:pPr>
-        <w:pStyle w:val="BodyText"/>
-      </w:pPr>
-      <w:r>
-        <w:rPr>
-          <w:b/>
-          <w:bCs/>
-        </w:rPr>
-        <w:t xml:space="preserve">Limitations:</w:t>
-      </w:r>
-      <w:r>
-        <w:t xml:space="preserve"> </w:t>
-      </w:r>
-      <w:r>
-        <w:t xml:space="preserve">First, the Aizenman-Chinn-Ito trilemma indices are available only through 2020, excluding the post-pandemic inflation surge of 2021–2024. Second, the chronic inflation measure is sensitive to threshold choice, though robustness checks confirm stability across alternative definitions. Third, IV/2SLS estimation using the Shambaugh (2004) base-country peg assignment as an instrument for ERS remains a planned extension; instrument merging and first-stage validation are pending and results are not reported in the current version. Fourth, System-GMM estimation (Blundell-Bond, collapsed instruments with lag-3 and lag-4 starts) was attempted but is not reported: Arellano-Bond tests reject at orders 2 (</w:t>
+        <w:t xml:space="preserve">lower</w:t>
+      </w:r>
+      <w:r>
+        <w:t xml:space="preserve"> </w:t>
+      </w:r>
+      <w:r>
+        <w:t xml:space="preserve">chronic-inflation probability (</w:t>
       </w:r>
       <m:oMath>
         <m:r>
-          <m:t>z</m:t>
+          <m:t>β</m:t>
         </m:r>
         <m:r>
           <m:rPr>
@@ -9326,7 +9339,7 @@
           <m:t>−</m:t>
         </m:r>
         <m:r>
-          <m:t>1.95</m:t>
+          <m:t>2.551</m:t>
         </m:r>
       </m:oMath>
       <w:r>
@@ -9346,15 +9359,46 @@
           <m:t>=</m:t>
         </m:r>
         <m:r>
-          <m:t>0.051</m:t>
+          <m:t>0.011</m:t>
         </m:r>
       </m:oMath>
       <w:r>
-        <w:t xml:space="preserve">) and 3 (</w:t>
+        <w:t xml:space="preserve">), consistent with the demand-compression channel. Only</w:t>
+      </w:r>
+      <w:r>
+        <w:t xml:space="preserve"> </w:t>
       </w:r>
       <m:oMath>
         <m:r>
-          <m:t>z</m:t>
+          <m:rPr>
+            <m:nor/>
+            <m:sty m:val="p"/>
+          </m:rPr>
+          <m:t>ERS</m:t>
+        </m:r>
+        <m:r>
+          <m:rPr>
+            <m:sty m:val="p"/>
+          </m:rPr>
+          <m:t>×</m:t>
+        </m:r>
+        <m:r>
+          <m:rPr>
+            <m:nor/>
+            <m:sty m:val="p"/>
+          </m:rPr>
+          <m:t>VIX</m:t>
+        </m:r>
+      </m:oMath>
+      <w:r>
+        <w:t xml:space="preserve"> </w:t>
+      </w:r>
+      <w:r>
+        <w:t xml:space="preserve">is statistically significant (</w:t>
+      </w:r>
+      <m:oMath>
+        <m:r>
+          <m:t>β</m:t>
         </m:r>
         <m:r>
           <m:rPr>
@@ -9363,7 +9407,13 @@
           <m:t>=</m:t>
         </m:r>
         <m:r>
-          <m:t>2.00</m:t>
+          <m:rPr>
+            <m:sty m:val="p"/>
+          </m:rPr>
+          <m:t>+</m:t>
+        </m:r>
+        <m:r>
+          <m:t>0.334</m:t>
         </m:r>
       </m:oMath>
       <w:r>
@@ -9383,11 +9433,110 @@
           <m:t>=</m:t>
         </m:r>
         <m:r>
-          <m:t>0.045</m:t>
+          <m:t>0.027</m:t>
         </m:r>
       </m:oMath>
       <w:r>
-        <w:t xml:space="preserve">), and the Sargan test fails (</w:t>
+        <w:t xml:space="preserve">): under normal conditions (VIX at mean), the ERS APE is</w:t>
+      </w:r>
+      <w:r>
+        <w:t xml:space="preserve"> </w:t>
+      </w:r>
+      <m:oMath>
+        <m:r>
+          <m:rPr>
+            <m:sty m:val="p"/>
+          </m:rPr>
+          <m:t>−</m:t>
+        </m:r>
+        <m:r>
+          <m:t>19.8</m:t>
+        </m:r>
+      </m:oMath>
+      <w:r>
+        <w:t xml:space="preserve"> </w:t>
+      </w:r>
+      <w:r>
+        <w:t xml:space="preserve">pp; at VIX+1SD, it weakens to</w:t>
+      </w:r>
+      <w:r>
+        <w:t xml:space="preserve"> </w:t>
+      </w:r>
+      <m:oMath>
+        <m:r>
+          <m:rPr>
+            <m:sty m:val="p"/>
+          </m:rPr>
+          <m:t>−</m:t>
+        </m:r>
+        <m:r>
+          <m:t>14.3</m:t>
+        </m:r>
+      </m:oMath>
+      <w:r>
+        <w:t xml:space="preserve"> </w:t>
+      </w:r>
+      <w:r>
+        <w:t xml:space="preserve">pp — a 28 per cent attenuation. MII</w:t>
+      </w:r>
+      <m:oMath>
+        <m:r>
+          <m:rPr>
+            <m:sty m:val="p"/>
+          </m:rPr>
+          <m:t>×</m:t>
+        </m:r>
+      </m:oMath>
+      <w:r>
+        <w:t xml:space="preserve">VIX (</w:t>
+      </w:r>
+      <m:oMath>
+        <m:r>
+          <m:t>p</m:t>
+        </m:r>
+        <m:r>
+          <m:rPr>
+            <m:sty m:val="p"/>
+          </m:rPr>
+          <m:t>=</m:t>
+        </m:r>
+        <m:r>
+          <m:t>0.246</m:t>
+        </m:r>
+      </m:oMath>
+      <w:r>
+        <w:t xml:space="preserve">) and KAOPEN</w:t>
+      </w:r>
+      <m:oMath>
+        <m:r>
+          <m:rPr>
+            <m:sty m:val="p"/>
+          </m:rPr>
+          <m:t>×</m:t>
+        </m:r>
+      </m:oMath>
+      <w:r>
+        <w:t xml:space="preserve">VIX (</w:t>
+      </w:r>
+      <m:oMath>
+        <m:r>
+          <m:t>p</m:t>
+        </m:r>
+        <m:r>
+          <m:rPr>
+            <m:sty m:val="p"/>
+          </m:rPr>
+          <m:t>=</m:t>
+        </m:r>
+        <m:r>
+          <m:t>0.346</m:t>
+        </m:r>
+      </m:oMath>
+      <w:r>
+        <w:t xml:space="preserve">) are not significant. The interactions are jointly marginally significant (LR</w:t>
+      </w:r>
+      <w:r>
+        <w:t xml:space="preserve"> </w:t>
       </w:r>
       <m:oMath>
         <m:sSup>
@@ -9409,6 +9558,542 @@
           <m:t>(</m:t>
         </m:r>
         <m:r>
+          <m:t>3</m:t>
+        </m:r>
+        <m:r>
+          <m:rPr>
+            <m:sty m:val="p"/>
+          </m:rPr>
+          <m:t>)</m:t>
+        </m:r>
+        <m:r>
+          <m:rPr>
+            <m:sty m:val="p"/>
+          </m:rPr>
+          <m:t>=</m:t>
+        </m:r>
+        <m:r>
+          <m:t>6.56</m:t>
+        </m:r>
+      </m:oMath>
+      <w:r>
+        <w:t xml:space="preserve">,</w:t>
+      </w:r>
+      <w:r>
+        <w:t xml:space="preserve"> </w:t>
+      </w:r>
+      <m:oMath>
+        <m:r>
+          <m:t>p</m:t>
+        </m:r>
+        <m:r>
+          <m:rPr>
+            <m:sty m:val="p"/>
+          </m:rPr>
+          <m:t>=</m:t>
+        </m:r>
+        <m:r>
+          <m:t>0.087</m:t>
+        </m:r>
+      </m:oMath>
+      <w:r>
+        <w:t xml:space="preserve">). These results provide</w:t>
+      </w:r>
+      <w:r>
+        <w:t xml:space="preserve"> </w:t>
+      </w:r>
+      <w:r>
+        <w:rPr>
+          <w:i/>
+          <w:iCs/>
+        </w:rPr>
+        <w:t xml:space="preserve">partial</w:t>
+      </w:r>
+      <w:r>
+        <w:t xml:space="preserve"> </w:t>
+      </w:r>
+      <w:r>
+        <w:t xml:space="preserve">support for the Rey dilemma hypothesis: the global financial cycle modulates the trilemma constraint rather than replacing it</w:t>
+      </w:r>
+      <w:r>
+        <w:t xml:space="preserve"> </w:t>
+      </w:r>
+      <w:r>
+        <w:t xml:space="preserve">(Bianchi &amp; Coulibaly, 2025; Gourinchas, 2023)</w:t>
+      </w:r>
+      <w:r>
+        <w:t xml:space="preserve">.</w:t>
+      </w:r>
+    </w:p>
+    <w:bookmarkEnd w:id="39"/>
+    <w:bookmarkStart w:id="40" w:name="inflation-persistence"/>
+    <w:p>
+      <w:pPr>
+        <w:pStyle w:val="Heading2"/>
+      </w:pPr>
+      <w:r>
+        <w:t xml:space="preserve">6.6 Inflation Persistence</w:t>
+      </w:r>
+    </w:p>
+    <w:p>
+      <w:pPr>
+        <w:pStyle w:val="FirstParagraph"/>
+      </w:pPr>
+      <w:r>
+        <w:t xml:space="preserve">Using the 36-month rolling AR(1) coefficient of CPI as a continuous dependent variable, none of the trilemma indices is statistically significant (MII:</w:t>
+      </w:r>
+      <w:r>
+        <w:t xml:space="preserve"> </w:t>
+      </w:r>
+      <m:oMath>
+        <m:r>
+          <m:t>b</m:t>
+        </m:r>
+        <m:r>
+          <m:rPr>
+            <m:sty m:val="p"/>
+          </m:rPr>
+          <m:t>=</m:t>
+        </m:r>
+        <m:r>
+          <m:rPr>
+            <m:sty m:val="p"/>
+          </m:rPr>
+          <m:t>−</m:t>
+        </m:r>
+        <m:r>
+          <m:t>0.033</m:t>
+        </m:r>
+      </m:oMath>
+      <w:r>
+        <w:t xml:space="preserve">,</w:t>
+      </w:r>
+      <w:r>
+        <w:t xml:space="preserve"> </w:t>
+      </w:r>
+      <m:oMath>
+        <m:r>
+          <m:t>p</m:t>
+        </m:r>
+        <m:r>
+          <m:rPr>
+            <m:sty m:val="p"/>
+          </m:rPr>
+          <m:t>=</m:t>
+        </m:r>
+        <m:r>
+          <m:t>0.299</m:t>
+        </m:r>
+      </m:oMath>
+      <w:r>
+        <w:t xml:space="preserve">; ERS:</w:t>
+      </w:r>
+      <w:r>
+        <w:t xml:space="preserve"> </w:t>
+      </w:r>
+      <m:oMath>
+        <m:r>
+          <m:t>b</m:t>
+        </m:r>
+        <m:r>
+          <m:rPr>
+            <m:sty m:val="p"/>
+          </m:rPr>
+          <m:t>=</m:t>
+        </m:r>
+        <m:r>
+          <m:rPr>
+            <m:sty m:val="p"/>
+          </m:rPr>
+          <m:t>+</m:t>
+        </m:r>
+        <m:r>
+          <m:t>0.015</m:t>
+        </m:r>
+      </m:oMath>
+      <w:r>
+        <w:t xml:space="preserve">,</w:t>
+      </w:r>
+      <w:r>
+        <w:t xml:space="preserve"> </w:t>
+      </w:r>
+      <m:oMath>
+        <m:r>
+          <m:t>p</m:t>
+        </m:r>
+        <m:r>
+          <m:rPr>
+            <m:sty m:val="p"/>
+          </m:rPr>
+          <m:t>=</m:t>
+        </m:r>
+        <m:r>
+          <m:t>0.507</m:t>
+        </m:r>
+      </m:oMath>
+      <w:r>
+        <w:t xml:space="preserve">; KAOPEN:</w:t>
+      </w:r>
+      <w:r>
+        <w:t xml:space="preserve"> </w:t>
+      </w:r>
+      <m:oMath>
+        <m:r>
+          <m:t>b</m:t>
+        </m:r>
+        <m:r>
+          <m:rPr>
+            <m:sty m:val="p"/>
+          </m:rPr>
+          <m:t>=</m:t>
+        </m:r>
+        <m:r>
+          <m:rPr>
+            <m:sty m:val="p"/>
+          </m:rPr>
+          <m:t>+</m:t>
+        </m:r>
+        <m:r>
+          <m:t>0.060</m:t>
+        </m:r>
+      </m:oMath>
+      <w:r>
+        <w:t xml:space="preserve">,</w:t>
+      </w:r>
+      <w:r>
+        <w:t xml:space="preserve"> </w:t>
+      </w:r>
+      <m:oMath>
+        <m:r>
+          <m:t>p</m:t>
+        </m:r>
+        <m:r>
+          <m:rPr>
+            <m:sty m:val="p"/>
+          </m:rPr>
+          <m:t>=</m:t>
+        </m:r>
+        <m:r>
+          <m:t>0.179</m:t>
+        </m:r>
+      </m:oMath>
+      <w:r>
+        <w:t xml:space="preserve">;</w:t>
+      </w:r>
+      <w:r>
+        <w:t xml:space="preserve"> </w:t>
+      </w:r>
+      <m:oMath>
+        <m:r>
+          <m:t>N</m:t>
+        </m:r>
+        <m:r>
+          <m:rPr>
+            <m:sty m:val="p"/>
+          </m:rPr>
+          <m:t>=</m:t>
+        </m:r>
+        <m:r>
+          <m:t>1</m:t>
+        </m:r>
+        <m:r>
+          <m:rPr>
+            <m:sty m:val="p"/>
+          </m:rPr>
+          <m:t>,</m:t>
+        </m:r>
+        <m:r>
+          <m:t>837</m:t>
+        </m:r>
+      </m:oMath>
+      <w:r>
+        <w:t xml:space="preserve">). This null result indicates that the trilemma configuration is associated with</w:t>
+      </w:r>
+      <w:r>
+        <w:t xml:space="preserve"> </w:t>
+      </w:r>
+      <w:r>
+        <w:rPr>
+          <w:i/>
+          <w:iCs/>
+        </w:rPr>
+        <w:t xml:space="preserve">entering</w:t>
+      </w:r>
+      <w:r>
+        <w:t xml:space="preserve"> </w:t>
+      </w:r>
+      <w:r>
+        <w:t xml:space="preserve">chronic episodes but not with inflation persistence conditional on already being in a chronic episode — a distinction with policy relevance: exchange-rate anchoring prevents chronic inflation from developing, but once entrenched, additional instruments (fiscal consolidation, institutional reform) are required.</w:t>
+      </w:r>
+    </w:p>
+    <w:bookmarkEnd w:id="40"/>
+    <w:bookmarkEnd w:id="41"/>
+    <w:bookmarkStart w:id="42" w:name="conclusion"/>
+    <w:p>
+      <w:pPr>
+        <w:pStyle w:val="Heading1"/>
+      </w:pPr>
+      <w:r>
+        <w:t xml:space="preserve">7. Conclusion</w:t>
+      </w:r>
+    </w:p>
+    <w:p>
+      <w:pPr>
+        <w:pStyle w:val="FirstParagraph"/>
+      </w:pPr>
+      <w:r>
+        <w:t xml:space="preserve">This paper demonstrates that a country’s position along the impossible trinity dimensions is a robust predictor of chronic inflation in developing economies. Exchange rate stability is the dominant anti-inflation trilemma instrument: a full shift from float to peg reduces the chronic-inflation probability by 19.8 percentage points (APE, RE Probit). Monetary independence, contrary to the credibility-loss hypothesis,</w:t>
+      </w:r>
+      <w:r>
+        <w:t xml:space="preserve"> </w:t>
+      </w:r>
+      <w:r>
+        <w:rPr>
+          <w:i/>
+          <w:iCs/>
+        </w:rPr>
+        <w:t xml:space="preserve">raises</w:t>
+      </w:r>
+      <w:r>
+        <w:t xml:space="preserve"> </w:t>
+      </w:r>
+      <w:r>
+        <w:t xml:space="preserve">chronic inflation probability by 18.3 pp — an empirical signature of the Barro-Gordon time-inconsistency equilibrium, in which central banks with full monetary discretion and no exchange-rate commitment device systematically overshoot socially optimal inflation. Capital account openness disciplines this bias by approximately 7.5 pp, consistent with the market-accountability channel.</w:t>
+      </w:r>
+    </w:p>
+    <w:p>
+      <w:pPr>
+        <w:pStyle w:val="BodyText"/>
+      </w:pPr>
+      <w:r>
+        <w:t xml:space="preserve">These results are stable across alternative chronic-inflation thresholds, sub-periods, and regional subsamples. The Barro-Gordon MII effect is strongest in the 1985–2000 era of currency crises (APE ≈ +42.4 pp) and weakens post-2001, consistent with global disinflation compressing the scope for discretionary inflation. A null result in the inflation-</w:t>
+      </w:r>
+      <w:r>
+        <w:rPr>
+          <w:i/>
+          <w:iCs/>
+        </w:rPr>
+        <w:t xml:space="preserve">persistence</w:t>
+      </w:r>
+      <w:r>
+        <w:t xml:space="preserve"> </w:t>
+      </w:r>
+      <w:r>
+        <w:t xml:space="preserve">regression distinguishes the trilemma’s role in initiating chronic episodes from the additional institutional and fiscal instruments required to exit them. A VIX-interaction test partially supports the Rey (2016) dilemma hypothesis: ERS anchor efficacy is attenuated by approximately 28 per cent when global financial stress rises by one standard deviation, though the trilemma is not fully compressed to a dilemma and the joint interaction test is only marginally significant (</w:t>
+      </w:r>
+      <m:oMath>
+        <m:r>
+          <m:t>p</m:t>
+        </m:r>
+        <m:r>
+          <m:rPr>
+            <m:sty m:val="p"/>
+          </m:rPr>
+          <m:t>=</m:t>
+        </m:r>
+        <m:r>
+          <m:t>0.087</m:t>
+        </m:r>
+      </m:oMath>
+      <w:r>
+        <w:t xml:space="preserve">).</w:t>
+      </w:r>
+    </w:p>
+    <w:p>
+      <w:pPr>
+        <w:pStyle w:val="BodyText"/>
+      </w:pPr>
+      <w:r>
+        <w:rPr>
+          <w:b/>
+          <w:bCs/>
+        </w:rPr>
+        <w:t xml:space="preserve">Policy implication:</w:t>
+      </w:r>
+      <w:r>
+        <w:t xml:space="preserve"> </w:t>
+      </w:r>
+      <w:r>
+        <w:t xml:space="preserve">Exchange-rate anchoring — rather than sacrificing monetary autonomy — is the primary trilemma instrument for eliminating chronic inflation in developing economies. Three institutional implications follow. First, IMF Article IV surveillance for Sub-Saharan African economies should treat ERS configuration as a first-order inflation risk factor: the estimated SSA ERS APE of −32.1 pp implies that a shift from managed float to a regional peg arrangement (such as the ECOWAS single-currency framework or the CFA franc zone) would generate the largest inflation-reduction dividend available within the trilemma. Second, central banks of South Asian economies (Bangladesh Bank, Nepal Rastra Bank, Sri Lanka’s Central Bank) currently debating managed-float adoption should weigh the evidence that regional ERS insignificance post-bootstrap reflects low within-region variation rather than an absence of the ERS mechanism. Third, the finding that capital account openness (KAOPEN APE = −7.5 pp) disciplines monetary discretion implies that IMF structural-program conditionality focused on capital-account liberalisation in SSA may amplify disinflation when paired with exchange-rate anchoring — but not as a substitute for it.</w:t>
+      </w:r>
+    </w:p>
+    <w:p>
+      <w:pPr>
+        <w:pStyle w:val="BodyText"/>
+      </w:pPr>
+      <w:r>
+        <w:rPr>
+          <w:b/>
+          <w:bCs/>
+        </w:rPr>
+        <w:t xml:space="preserve">Limitations:</w:t>
+      </w:r>
+      <w:r>
+        <w:t xml:space="preserve"> </w:t>
+      </w:r>
+      <w:r>
+        <w:t xml:space="preserve">First, the Aizenman-Chinn-Ito trilemma indices are available only through 2020, excluding the post-pandemic inflation surge of 2021–2024. Second, the chronic inflation measure is sensitive to threshold choice, though robustness checks confirm stability across alternative definitions. Third, the FE-2SLS specification using the Shambaugh (2004) base-country peg produces a strong first stage (FS-F = 905.95, KP clustered; reported in Table 5) and confirms the causal ERS effect (</w:t>
+      </w:r>
+      <m:oMath>
+        <m:sSub>
+          <m:e>
+            <m:r>
+              <m:t>b</m:t>
+            </m:r>
+          </m:e>
+          <m:sub>
+            <m:r>
+              <m:rPr>
+                <m:nor/>
+                <m:sty m:val="p"/>
+              </m:rPr>
+              <m:t>ERS</m:t>
+            </m:r>
+          </m:sub>
+        </m:sSub>
+        <m:r>
+          <m:rPr>
+            <m:sty m:val="p"/>
+          </m:rPr>
+          <m:t>=</m:t>
+        </m:r>
+        <m:r>
+          <m:rPr>
+            <m:sty m:val="p"/>
+          </m:rPr>
+          <m:t>−</m:t>
+        </m:r>
+        <m:sSup>
+          <m:e>
+            <m:r>
+              <m:t>1.106</m:t>
+            </m:r>
+          </m:e>
+          <m:sup>
+            <m:r>
+              <m:rPr>
+                <m:sty m:val="p"/>
+              </m:rPr>
+              <m:t>*</m:t>
+            </m:r>
+            <m:r>
+              <m:rPr>
+                <m:sty m:val="p"/>
+              </m:rPr>
+              <m:t>*</m:t>
+            </m:r>
+            <m:r>
+              <m:rPr>
+                <m:sty m:val="p"/>
+              </m:rPr>
+              <m:t>*</m:t>
+            </m:r>
+          </m:sup>
+        </m:sSup>
+      </m:oMath>
+      <w:r>
+        <w:t xml:space="preserve">); the exclusion restriction — that base-country linkages affect chronic inflation only through ERS — relies on historical and political assignment and cannot be directly tested. Fourth, System-GMM estimation (Blundell-Bond, collapsed instruments with lag-3 and lag-4 starts) was attempted but is not reported: Arellano-Bond tests reject at orders 2 (</w:t>
+      </w:r>
+      <m:oMath>
+        <m:r>
+          <m:t>z</m:t>
+        </m:r>
+        <m:r>
+          <m:rPr>
+            <m:sty m:val="p"/>
+          </m:rPr>
+          <m:t>=</m:t>
+        </m:r>
+        <m:r>
+          <m:rPr>
+            <m:sty m:val="p"/>
+          </m:rPr>
+          <m:t>−</m:t>
+        </m:r>
+        <m:r>
+          <m:t>1.95</m:t>
+        </m:r>
+      </m:oMath>
+      <w:r>
+        <w:t xml:space="preserve">,</w:t>
+      </w:r>
+      <w:r>
+        <w:t xml:space="preserve"> </w:t>
+      </w:r>
+      <m:oMath>
+        <m:r>
+          <m:t>p</m:t>
+        </m:r>
+        <m:r>
+          <m:rPr>
+            <m:sty m:val="p"/>
+          </m:rPr>
+          <m:t>=</m:t>
+        </m:r>
+        <m:r>
+          <m:t>0.051</m:t>
+        </m:r>
+      </m:oMath>
+      <w:r>
+        <w:t xml:space="preserve">) and 3 (</w:t>
+      </w:r>
+      <m:oMath>
+        <m:r>
+          <m:t>z</m:t>
+        </m:r>
+        <m:r>
+          <m:rPr>
+            <m:sty m:val="p"/>
+          </m:rPr>
+          <m:t>=</m:t>
+        </m:r>
+        <m:r>
+          <m:t>2.00</m:t>
+        </m:r>
+      </m:oMath>
+      <w:r>
+        <w:t xml:space="preserve">,</w:t>
+      </w:r>
+      <w:r>
+        <w:t xml:space="preserve"> </w:t>
+      </w:r>
+      <m:oMath>
+        <m:r>
+          <m:t>p</m:t>
+        </m:r>
+        <m:r>
+          <m:rPr>
+            <m:sty m:val="p"/>
+          </m:rPr>
+          <m:t>=</m:t>
+        </m:r>
+        <m:r>
+          <m:t>0.045</m:t>
+        </m:r>
+      </m:oMath>
+      <w:r>
+        <w:t xml:space="preserve">), and the Sargan test fails (</w:t>
+      </w:r>
+      <m:oMath>
+        <m:sSup>
+          <m:e>
+            <m:r>
+              <m:t>χ</m:t>
+            </m:r>
+          </m:e>
+          <m:sup>
+            <m:r>
+              <m:t>2</m:t>
+            </m:r>
+          </m:sup>
+        </m:sSup>
+        <m:r>
+          <m:rPr>
+            <m:sty m:val="p"/>
+          </m:rPr>
+          <m:t>(</m:t>
+        </m:r>
+        <m:r>
           <m:t>10</m:t>
         </m:r>
         <m:r>
@@ -9539,8 +10224,8 @@
         <w:t xml:space="preserve">Extending the trilemma index series to 2024 using AREAER data would allow testing whether post-pandemic monetary tightening in historically low-MII countries generates systematic disinflation reversals, a question with direct policy relevance for the current global inflation cycle.</w:t>
       </w:r>
     </w:p>
-    <w:bookmarkEnd w:id="40"/>
-    <w:bookmarkStart w:id="92" w:name="references"/>
+    <w:bookmarkEnd w:id="42"/>
+    <w:bookmarkStart w:id="94" w:name="references"/>
     <w:p>
       <w:pPr>
         <w:pStyle w:val="Heading1"/>
@@ -9549,8 +10234,8 @@
         <w:t xml:space="preserve">8. References</w:t>
       </w:r>
     </w:p>
-    <w:bookmarkStart w:id="91" w:name="refs"/>
-    <w:bookmarkStart w:id="42" w:name="ref-aizenmanChinnIto2010"/>
+    <w:bookmarkStart w:id="93" w:name="refs"/>
+    <w:bookmarkStart w:id="44" w:name="ref-aizenmanChinnIto2010"/>
     <w:p>
       <w:pPr>
         <w:pStyle w:val="Bibliography"/>
@@ -9587,7 +10272,7 @@
       <w:r>
         <w:t xml:space="preserve"> </w:t>
       </w:r>
-      <w:hyperlink r:id="rId41">
+      <w:hyperlink r:id="rId43">
         <w:r>
           <w:rPr>
             <w:rStyle w:val="Hyperlink"/>
@@ -9596,8 +10281,8 @@
         </w:r>
       </w:hyperlink>
     </w:p>
-    <w:bookmarkEnd w:id="42"/>
-    <w:bookmarkStart w:id="44" w:name="ref-aizenmanChinnIto2013"/>
+    <w:bookmarkEnd w:id="44"/>
+    <w:bookmarkStart w:id="46" w:name="ref-aizenmanChinnIto2013"/>
     <w:p>
       <w:pPr>
         <w:pStyle w:val="Bibliography"/>
@@ -9646,7 +10331,7 @@
       <w:r>
         <w:t xml:space="preserve"> </w:t>
       </w:r>
-      <w:hyperlink r:id="rId43">
+      <w:hyperlink r:id="rId45">
         <w:r>
           <w:rPr>
             <w:rStyle w:val="Hyperlink"/>
@@ -9655,8 +10340,8 @@
         </w:r>
       </w:hyperlink>
     </w:p>
-    <w:bookmarkEnd w:id="44"/>
-    <w:bookmarkStart w:id="46" w:name="ref-countrycode"/>
+    <w:bookmarkEnd w:id="46"/>
+    <w:bookmarkStart w:id="48" w:name="ref-countrycode"/>
     <w:p>
       <w:pPr>
         <w:pStyle w:val="Bibliography"/>
@@ -9705,7 +10390,7 @@
       <w:r>
         <w:t xml:space="preserve"> </w:t>
       </w:r>
-      <w:hyperlink r:id="rId45">
+      <w:hyperlink r:id="rId47">
         <w:r>
           <w:rPr>
             <w:rStyle w:val="Hyperlink"/>
@@ -9714,8 +10399,8 @@
         </w:r>
       </w:hyperlink>
     </w:p>
-    <w:bookmarkEnd w:id="46"/>
-    <w:bookmarkStart w:id="48" w:name="ref-athanasopoulosMasciandaro2025"/>
+    <w:bookmarkEnd w:id="48"/>
+    <w:bookmarkStart w:id="50" w:name="ref-athanasopoulosMasciandaro2025"/>
     <w:p>
       <w:pPr>
         <w:pStyle w:val="Bibliography"/>
@@ -9739,7 +10424,7 @@
       <w:r>
         <w:t xml:space="preserve"> </w:t>
       </w:r>
-      <w:hyperlink r:id="rId47">
+      <w:hyperlink r:id="rId49">
         <w:r>
           <w:rPr>
             <w:rStyle w:val="Hyperlink"/>
@@ -9748,8 +10433,8 @@
         </w:r>
       </w:hyperlink>
     </w:p>
-    <w:bookmarkEnd w:id="48"/>
-    <w:bookmarkStart w:id="50" w:name="ref-barro1983"/>
+    <w:bookmarkEnd w:id="50"/>
+    <w:bookmarkStart w:id="52" w:name="ref-barro1983"/>
     <w:p>
       <w:pPr>
         <w:pStyle w:val="Bibliography"/>
@@ -9786,7 +10471,7 @@
       <w:r>
         <w:t xml:space="preserve"> </w:t>
       </w:r>
-      <w:hyperlink r:id="rId49">
+      <w:hyperlink r:id="rId51">
         <w:r>
           <w:rPr>
             <w:rStyle w:val="Hyperlink"/>
@@ -9795,8 +10480,8 @@
         </w:r>
       </w:hyperlink>
     </w:p>
-    <w:bookmarkEnd w:id="50"/>
-    <w:bookmarkStart w:id="52" w:name="ref-bianchiCoulibaly2025"/>
+    <w:bookmarkEnd w:id="52"/>
+    <w:bookmarkStart w:id="54" w:name="ref-bianchiCoulibaly2025"/>
     <w:p>
       <w:pPr>
         <w:pStyle w:val="Bibliography"/>
@@ -9820,7 +10505,7 @@
       <w:r>
         <w:t xml:space="preserve"> </w:t>
       </w:r>
-      <w:hyperlink r:id="rId51">
+      <w:hyperlink r:id="rId53">
         <w:r>
           <w:rPr>
             <w:rStyle w:val="Hyperlink"/>
@@ -9829,8 +10514,8 @@
         </w:r>
       </w:hyperlink>
     </w:p>
-    <w:bookmarkEnd w:id="52"/>
-    <w:bookmarkStart w:id="54" w:name="ref-cavalloContani1997"/>
+    <w:bookmarkEnd w:id="54"/>
+    <w:bookmarkStart w:id="56" w:name="ref-cavalloContani1997"/>
     <w:p>
       <w:pPr>
         <w:pStyle w:val="Bibliography"/>
@@ -9876,7 +10561,7 @@
       <w:r>
         <w:t xml:space="preserve"> </w:t>
       </w:r>
-      <w:hyperlink r:id="rId53">
+      <w:hyperlink r:id="rId55">
         <w:r>
           <w:rPr>
             <w:rStyle w:val="Hyperlink"/>
@@ -9885,8 +10570,8 @@
         </w:r>
       </w:hyperlink>
     </w:p>
-    <w:bookmarkEnd w:id="54"/>
-    <w:bookmarkStart w:id="56" w:name="ref-citciKaya2023"/>
+    <w:bookmarkEnd w:id="56"/>
+    <w:bookmarkStart w:id="58" w:name="ref-citciKaya2023"/>
     <w:p>
       <w:pPr>
         <w:pStyle w:val="Bibliography"/>
@@ -9910,7 +10595,7 @@
       <w:r>
         <w:t xml:space="preserve"> </w:t>
       </w:r>
-      <w:hyperlink r:id="rId55">
+      <w:hyperlink r:id="rId57">
         <w:r>
           <w:rPr>
             <w:rStyle w:val="Hyperlink"/>
@@ -9919,8 +10604,8 @@
         </w:r>
       </w:hyperlink>
     </w:p>
-    <w:bookmarkEnd w:id="56"/>
-    <w:bookmarkStart w:id="58" w:name="ref-croissantMillo2008"/>
+    <w:bookmarkEnd w:id="58"/>
+    <w:bookmarkStart w:id="60" w:name="ref-croissantMillo2008"/>
     <w:p>
       <w:pPr>
         <w:pStyle w:val="Bibliography"/>
@@ -9966,7 +10651,7 @@
       <w:r>
         <w:t xml:space="preserve"> </w:t>
       </w:r>
-      <w:hyperlink r:id="rId57">
+      <w:hyperlink r:id="rId59">
         <w:r>
           <w:rPr>
             <w:rStyle w:val="Hyperlink"/>
@@ -9975,8 +10660,8 @@
         </w:r>
       </w:hyperlink>
     </w:p>
-    <w:bookmarkEnd w:id="58"/>
-    <w:bookmarkStart w:id="60" w:name="ref-delaTorre2003"/>
+    <w:bookmarkEnd w:id="60"/>
+    <w:bookmarkStart w:id="62" w:name="ref-delaTorre2003"/>
     <w:p>
       <w:pPr>
         <w:pStyle w:val="Bibliography"/>
@@ -10027,7 +10712,7 @@
       <w:r>
         <w:t xml:space="preserve"> </w:t>
       </w:r>
-      <w:hyperlink r:id="rId59">
+      <w:hyperlink r:id="rId61">
         <w:r>
           <w:rPr>
             <w:rStyle w:val="Hyperlink"/>
@@ -10036,8 +10721,8 @@
         </w:r>
       </w:hyperlink>
     </w:p>
-    <w:bookmarkEnd w:id="60"/>
-    <w:bookmarkStart w:id="62" w:name="ref-driscolKraay1998"/>
+    <w:bookmarkEnd w:id="62"/>
+    <w:bookmarkStart w:id="64" w:name="ref-driscolKraay1998"/>
     <w:p>
       <w:pPr>
         <w:pStyle w:val="Bibliography"/>
@@ -10074,7 +10759,7 @@
       <w:r>
         <w:t xml:space="preserve"> </w:t>
       </w:r>
-      <w:hyperlink r:id="rId61">
+      <w:hyperlink r:id="rId63">
         <w:r>
           <w:rPr>
             <w:rStyle w:val="Hyperlink"/>
@@ -10083,8 +10768,8 @@
         </w:r>
       </w:hyperlink>
     </w:p>
-    <w:bookmarkEnd w:id="62"/>
-    <w:bookmarkStart w:id="64" w:name="ref-farhiWerning2014"/>
+    <w:bookmarkEnd w:id="64"/>
+    <w:bookmarkStart w:id="66" w:name="ref-farhiWerning2014"/>
     <w:p>
       <w:pPr>
         <w:pStyle w:val="Bibliography"/>
@@ -10121,7 +10806,7 @@
       <w:r>
         <w:t xml:space="preserve"> </w:t>
       </w:r>
-      <w:hyperlink r:id="rId63">
+      <w:hyperlink r:id="rId65">
         <w:r>
           <w:rPr>
             <w:rStyle w:val="Hyperlink"/>
@@ -10130,8 +10815,8 @@
         </w:r>
       </w:hyperlink>
     </w:p>
-    <w:bookmarkEnd w:id="64"/>
-    <w:bookmarkStart w:id="66" w:name="ref-fischerSahay2002"/>
+    <w:bookmarkEnd w:id="66"/>
+    <w:bookmarkStart w:id="68" w:name="ref-fischerSahay2002"/>
     <w:p>
       <w:pPr>
         <w:pStyle w:val="Bibliography"/>
@@ -10168,7 +10853,7 @@
       <w:r>
         <w:t xml:space="preserve"> </w:t>
       </w:r>
-      <w:hyperlink r:id="rId65">
+      <w:hyperlink r:id="rId67">
         <w:r>
           <w:rPr>
             <w:rStyle w:val="Hyperlink"/>
@@ -10177,8 +10862,8 @@
         </w:r>
       </w:hyperlink>
     </w:p>
-    <w:bookmarkEnd w:id="66"/>
-    <w:bookmarkStart w:id="68" w:name="ref-fleming1962"/>
+    <w:bookmarkEnd w:id="68"/>
+    <w:bookmarkStart w:id="70" w:name="ref-fleming1962"/>
     <w:p>
       <w:pPr>
         <w:pStyle w:val="Bibliography"/>
@@ -10215,7 +10900,7 @@
       <w:r>
         <w:t xml:space="preserve"> </w:t>
       </w:r>
-      <w:hyperlink r:id="rId67">
+      <w:hyperlink r:id="rId69">
         <w:r>
           <w:rPr>
             <w:rStyle w:val="Hyperlink"/>
@@ -10224,8 +10909,8 @@
         </w:r>
       </w:hyperlink>
     </w:p>
-    <w:bookmarkEnd w:id="68"/>
-    <w:bookmarkStart w:id="70" w:name="ref-fritschPua2021"/>
+    <w:bookmarkEnd w:id="70"/>
+    <w:bookmarkStart w:id="72" w:name="ref-fritschPua2021"/>
     <w:p>
       <w:pPr>
         <w:pStyle w:val="Bibliography"/>
@@ -10262,7 +10947,7 @@
       <w:r>
         <w:t xml:space="preserve"> </w:t>
       </w:r>
-      <w:hyperlink r:id="rId69">
+      <w:hyperlink r:id="rId71">
         <w:r>
           <w:rPr>
             <w:rStyle w:val="Hyperlink"/>
@@ -10271,8 +10956,8 @@
         </w:r>
       </w:hyperlink>
     </w:p>
-    <w:bookmarkEnd w:id="70"/>
-    <w:bookmarkStart w:id="72" w:name="ref-gourinchas2023"/>
+    <w:bookmarkEnd w:id="72"/>
+    <w:bookmarkStart w:id="74" w:name="ref-gourinchas2023"/>
     <w:p>
       <w:pPr>
         <w:pStyle w:val="Bibliography"/>
@@ -10318,7 +11003,7 @@
       <w:r>
         <w:t xml:space="preserve"> </w:t>
       </w:r>
-      <w:hyperlink r:id="rId71">
+      <w:hyperlink r:id="rId73">
         <w:r>
           <w:rPr>
             <w:rStyle w:val="Hyperlink"/>
@@ -10327,8 +11012,8 @@
         </w:r>
       </w:hyperlink>
     </w:p>
-    <w:bookmarkEnd w:id="72"/>
-    <w:bookmarkStart w:id="74" w:name="ref-itoKawai2024"/>
+    <w:bookmarkEnd w:id="74"/>
+    <w:bookmarkStart w:id="76" w:name="ref-itoKawai2024"/>
     <w:p>
       <w:pPr>
         <w:pStyle w:val="Bibliography"/>
@@ -10365,7 +11050,7 @@
       <w:r>
         <w:t xml:space="preserve"> </w:t>
       </w:r>
-      <w:hyperlink r:id="rId73">
+      <w:hyperlink r:id="rId75">
         <w:r>
           <w:rPr>
             <w:rStyle w:val="Hyperlink"/>
@@ -10374,8 +11059,8 @@
         </w:r>
       </w:hyperlink>
     </w:p>
-    <w:bookmarkEnd w:id="74"/>
-    <w:bookmarkStart w:id="76" w:name="ref-kleinShambaugh2015"/>
+    <w:bookmarkEnd w:id="76"/>
+    <w:bookmarkStart w:id="78" w:name="ref-kleinShambaugh2015"/>
     <w:p>
       <w:pPr>
         <w:pStyle w:val="Bibliography"/>
@@ -10412,7 +11097,7 @@
       <w:r>
         <w:t xml:space="preserve"> </w:t>
       </w:r>
-      <w:hyperlink r:id="rId75">
+      <w:hyperlink r:id="rId77">
         <w:r>
           <w:rPr>
             <w:rStyle w:val="Hyperlink"/>
@@ -10421,8 +11106,8 @@
         </w:r>
       </w:hyperlink>
     </w:p>
-    <w:bookmarkEnd w:id="76"/>
-    <w:bookmarkStart w:id="78" w:name="ref-montes2024"/>
+    <w:bookmarkEnd w:id="78"/>
+    <w:bookmarkStart w:id="80" w:name="ref-montes2024"/>
     <w:p>
       <w:pPr>
         <w:pStyle w:val="Bibliography"/>
@@ -10459,7 +11144,7 @@
       <w:r>
         <w:t xml:space="preserve"> </w:t>
       </w:r>
-      <w:hyperlink r:id="rId77">
+      <w:hyperlink r:id="rId79">
         <w:r>
           <w:rPr>
             <w:rStyle w:val="Hyperlink"/>
@@ -10468,8 +11153,8 @@
         </w:r>
       </w:hyperlink>
     </w:p>
-    <w:bookmarkEnd w:id="78"/>
-    <w:bookmarkStart w:id="80" w:name="ref-mundell1963"/>
+    <w:bookmarkEnd w:id="80"/>
+    <w:bookmarkStart w:id="82" w:name="ref-mundell1963"/>
     <w:p>
       <w:pPr>
         <w:pStyle w:val="Bibliography"/>
@@ -10506,7 +11191,7 @@
       <w:r>
         <w:t xml:space="preserve"> </w:t>
       </w:r>
-      <w:hyperlink r:id="rId79">
+      <w:hyperlink r:id="rId81">
         <w:r>
           <w:rPr>
             <w:rStyle w:val="Hyperlink"/>
@@ -10515,8 +11200,8 @@
         </w:r>
       </w:hyperlink>
     </w:p>
-    <w:bookmarkEnd w:id="80"/>
-    <w:bookmarkStart w:id="82" w:name="ref-pesaran2007"/>
+    <w:bookmarkEnd w:id="82"/>
+    <w:bookmarkStart w:id="84" w:name="ref-pesaran2007"/>
     <w:p>
       <w:pPr>
         <w:pStyle w:val="Bibliography"/>
@@ -10553,7 +11238,7 @@
       <w:r>
         <w:t xml:space="preserve"> </w:t>
       </w:r>
-      <w:hyperlink r:id="rId81">
+      <w:hyperlink r:id="rId83">
         <w:r>
           <w:rPr>
             <w:rStyle w:val="Hyperlink"/>
@@ -10562,8 +11247,8 @@
         </w:r>
       </w:hyperlink>
     </w:p>
-    <w:bookmarkEnd w:id="82"/>
-    <w:bookmarkStart w:id="84" w:name="ref-rey2016"/>
+    <w:bookmarkEnd w:id="84"/>
+    <w:bookmarkStart w:id="86" w:name="ref-rey2016"/>
     <w:p>
       <w:pPr>
         <w:pStyle w:val="Bibliography"/>
@@ -10612,7 +11297,7 @@
       <w:r>
         <w:t xml:space="preserve"> </w:t>
       </w:r>
-      <w:hyperlink r:id="rId83">
+      <w:hyperlink r:id="rId85">
         <w:r>
           <w:rPr>
             <w:rStyle w:val="Hyperlink"/>
@@ -10621,8 +11306,8 @@
         </w:r>
       </w:hyperlink>
     </w:p>
-    <w:bookmarkEnd w:id="84"/>
-    <w:bookmarkStart w:id="86" w:name="ref-shambaugh2004"/>
+    <w:bookmarkEnd w:id="86"/>
+    <w:bookmarkStart w:id="88" w:name="ref-shambaugh2004"/>
     <w:p>
       <w:pPr>
         <w:pStyle w:val="Bibliography"/>
@@ -10659,7 +11344,7 @@
       <w:r>
         <w:t xml:space="preserve"> </w:t>
       </w:r>
-      <w:hyperlink r:id="rId85">
+      <w:hyperlink r:id="rId87">
         <w:r>
           <w:rPr>
             <w:rStyle w:val="Hyperlink"/>
@@ -10668,8 +11353,8 @@
         </w:r>
       </w:hyperlink>
     </w:p>
-    <w:bookmarkEnd w:id="86"/>
-    <w:bookmarkStart w:id="88" w:name="ref-sigmundFerstl2021"/>
+    <w:bookmarkEnd w:id="88"/>
+    <w:bookmarkStart w:id="90" w:name="ref-sigmundFerstl2021"/>
     <w:p>
       <w:pPr>
         <w:pStyle w:val="Bibliography"/>
@@ -10718,7 +11403,7 @@
       <w:r>
         <w:t xml:space="preserve"> </w:t>
       </w:r>
-      <w:hyperlink r:id="rId87">
+      <w:hyperlink r:id="rId89">
         <w:r>
           <w:rPr>
             <w:rStyle w:val="Hyperlink"/>
@@ -10727,8 +11412,8 @@
         </w:r>
       </w:hyperlink>
     </w:p>
-    <w:bookmarkEnd w:id="88"/>
-    <w:bookmarkStart w:id="90" w:name="ref-windmeijer2005"/>
+    <w:bookmarkEnd w:id="90"/>
+    <w:bookmarkStart w:id="92" w:name="ref-windmeijer2005"/>
     <w:p>
       <w:pPr>
         <w:pStyle w:val="Bibliography"/>
@@ -10777,7 +11462,7 @@
       <w:r>
         <w:t xml:space="preserve"> </w:t>
       </w:r>
-      <w:hyperlink r:id="rId89">
+      <w:hyperlink r:id="rId91">
         <w:r>
           <w:rPr>
             <w:rStyle w:val="Hyperlink"/>
@@ -10786,8 +11471,8 @@
         </w:r>
       </w:hyperlink>
     </w:p>
-    <w:bookmarkEnd w:id="90"/>
-    <w:bookmarkEnd w:id="91"/>
+    <w:bookmarkEnd w:id="92"/>
+    <w:bookmarkEnd w:id="93"/>
     <w:p>
       <w:r>
         <w:pict>
@@ -10881,7 +11566,7 @@
         <w:t xml:space="preserve">None.</w:t>
       </w:r>
     </w:p>
-    <w:bookmarkEnd w:id="92"/>
+    <w:bookmarkEnd w:id="94"/>
     <w:sectPr>
       <w:footnotePr>
         <w:numRestart w:val="eachSect"/>

</xml_diff>